<commit_message>
changes for dashboard page
</commit_message>
<xml_diff>
--- a/Project Stand Up 3/Group 4 - Visualization Design Book.docx
+++ b/Project Stand Up 3/Group 4 - Visualization Design Book.docx
@@ -1094,9 +1094,11 @@
             <w:hideMark/>
           </w:tcPr>
           <w:p>
+            <w:proofErr w:type="spellStart"/>
             <w:r>
               <w:t>jin</w:t>
             </w:r>
+            <w:proofErr w:type="spellEnd"/>
           </w:p>
         </w:tc>
       </w:tr>
@@ -1212,9 +1214,11 @@
             <w:hideMark/>
           </w:tcPr>
           <w:p>
+            <w:proofErr w:type="spellStart"/>
             <w:r>
               <w:t>kuso</w:t>
             </w:r>
+            <w:proofErr w:type="spellEnd"/>
           </w:p>
         </w:tc>
       </w:tr>
@@ -1224,6 +1228,7 @@
       <w:sdtPr>
         <w:rPr>
           <w:rFonts w:asciiTheme="minorHAnsi" w:eastAsiaTheme="minorEastAsia" w:hAnsiTheme="minorHAnsi" w:cstheme="minorBidi"/>
+          <w:b w:val="0"/>
           <w:color w:val="auto"/>
           <w:kern w:val="2"/>
           <w:sz w:val="24"/>
@@ -1918,19 +1923,19 @@
         <w:rPr>
           <w:rFonts w:ascii="Times New Roman" w:hAnsi="Times New Roman" w:cs="Times New Roman"/>
         </w:rPr>
-        <w:t>Across Australia, road traffic accidents continue to be a significant public health and economic concern. Identifying the most effective methods to reduce these crashes requires a thorough, evidence-based approach. The Bureau of Infrastructure and Transport Research Economics (BITRE) has maintained a cohesive record of road safety enforcement activities</w:t>
-      </w:r>
-      <w:r>
-        <w:rPr>
-          <w:rFonts w:ascii="Times New Roman" w:hAnsi="Times New Roman" w:cs="Times New Roman"/>
-        </w:rPr>
-        <w:t xml:space="preserve">, </w:t>
-      </w:r>
-      <w:r>
-        <w:rPr>
-          <w:rFonts w:ascii="Times New Roman" w:hAnsi="Times New Roman" w:cs="Times New Roman"/>
-        </w:rPr>
-        <w:t>such as speeding, seatbelt non-compliance, mobile phone usage, and drug testing</w:t>
+        <w:t>Across Australia, road traffic accidents continue to be a significant public health and economic concern. Identifying the most effective methods to reduce these crashes requires a rigorous, evidence-based approach to enforcement. The Bureau of Infrastructure and Transport Research Economics (BITRE) has maintained comprehensive records of road safety enforcement activities</w:t>
+      </w:r>
+      <w:r>
+        <w:rPr>
+          <w:rFonts w:ascii="Times New Roman" w:hAnsi="Times New Roman" w:cs="Times New Roman"/>
+        </w:rPr>
+        <w:t xml:space="preserve"> such as </w:t>
+      </w:r>
+      <w:r>
+        <w:rPr>
+          <w:rFonts w:ascii="Times New Roman" w:hAnsi="Times New Roman" w:cs="Times New Roman"/>
+        </w:rPr>
+        <w:t>spanning speeding, seatbelt non-compliance, mobile phone usage, and drug testing</w:t>
       </w:r>
       <w:r>
         <w:rPr>
@@ -1942,7 +1947,7 @@
         <w:rPr>
           <w:rFonts w:ascii="Times New Roman" w:hAnsi="Times New Roman" w:cs="Times New Roman"/>
         </w:rPr>
-        <w:t>dating back to 2008.</w:t>
+        <w:t>since 2008.</w:t>
       </w:r>
     </w:p>
     <w:p>
@@ -1957,7 +1962,7 @@
         <w:rPr>
           <w:rFonts w:ascii="Times New Roman" w:hAnsi="Times New Roman" w:cs="Times New Roman"/>
         </w:rPr>
-        <w:t>Historically, this data was published in a highly aggregated form. However, to account for the complex demographic and geographic characteristics driving road infractions, BITRE updated its collection methods in 2023. The dataset now features fine-grained, multi-dimensional variables, including precise geographical typologies, age group breakdowns, and crucially, the distinction between monetary fines, direct arrests, and formal criminal charges stemming from the same offence.</w:t>
+        <w:t>Historically, this data was published in a highly aggregated format. However, to account for the complex demographic and geographic characteristics driving road infractions, BITRE updated its collection methodology in 2023. The dataset now features fine-grained, multi-dimensional variables, including precise geographical typologies, age group breakdowns, and crucially, the distinction between monetary fines, direct arrests, and formal criminal charges stemming from the same offence.</w:t>
       </w:r>
     </w:p>
     <w:p>
@@ -1972,44 +1977,8 @@
         <w:rPr>
           <w:rFonts w:ascii="Times New Roman" w:hAnsi="Times New Roman" w:cs="Times New Roman"/>
         </w:rPr>
-        <w:t>A significant drawback of BITRE’s current official Police Enforcement Dashboard is that it still relies on summary-level data, failing to reflect this new structural depth. This oversight masks critical public safety narratives, including geographical disparities in policing methodologies and the disproportionate penalization risks among youth populations across different Australian jurisdictions.</w:t>
-      </w:r>
-    </w:p>
-    <w:p>
-      <w:pPr>
-        <w:spacing w:line="360" w:lineRule="auto"/>
-        <w:jc w:val="both"/>
-        <w:rPr>
-          <w:rFonts w:ascii="Times New Roman" w:hAnsi="Times New Roman" w:cs="Times New Roman"/>
-        </w:rPr>
-      </w:pPr>
-    </w:p>
-    <w:p>
-      <w:pPr>
-        <w:spacing w:line="360" w:lineRule="auto"/>
-        <w:jc w:val="both"/>
-        <w:rPr>
-          <w:rFonts w:ascii="Times New Roman" w:hAnsi="Times New Roman" w:cs="Times New Roman"/>
-        </w:rPr>
-      </w:pPr>
-    </w:p>
-    <w:p>
-      <w:pPr>
-        <w:spacing w:line="360" w:lineRule="auto"/>
-        <w:jc w:val="both"/>
-        <w:rPr>
-          <w:rFonts w:ascii="Times New Roman" w:hAnsi="Times New Roman" w:cs="Times New Roman"/>
-        </w:rPr>
-      </w:pPr>
-    </w:p>
-    <w:p>
-      <w:pPr>
-        <w:spacing w:line="360" w:lineRule="auto"/>
-        <w:jc w:val="both"/>
-        <w:rPr>
-          <w:rFonts w:ascii="Times New Roman" w:hAnsi="Times New Roman" w:cs="Times New Roman"/>
-        </w:rPr>
-      </w:pPr>
+        <w:t>A significant drawback of BITRE’s current official Police Enforcement Dashboard is its reliance on summary-level data, which fails to reflect this new structural depth. This oversight masks critical public safety narratives. Academic research has long highlighted the tension between automated enforcement and manual police intervention; while automated cameras are highly effective at mass compliance, they are often critiqued by the public as revenue-generating rather than safety-focused, whereas manual policing is proven to be essential for intercepting high-risk behaviours like unlicensed driving or intoxication (De Pauw et al., 2014; WHO, 2023). Without visualising these discrepancies, policymakers cannot accurately assess whether automated cameras are functioning primarily as revenue streams, or if police presence is effectively deterring severe criminal traffic behaviour.</w:t>
+      </w:r>
     </w:p>
     <w:p>
       <w:pPr>
@@ -2093,21 +2062,13 @@
           <w:b/>
           <w:bCs/>
         </w:rPr>
-        <w:t xml:space="preserve">The </w:t>
-      </w:r>
-      <w:r>
-        <w:rPr>
-          <w:rFonts w:ascii="Times New Roman" w:hAnsi="Times New Roman" w:cs="Times New Roman"/>
-          <w:b/>
-          <w:bCs/>
-        </w:rPr>
-        <w:t>Traffic policymakers</w:t>
-      </w:r>
-      <w:r>
-        <w:rPr>
-          <w:rFonts w:ascii="Times New Roman" w:hAnsi="Times New Roman" w:cs="Times New Roman"/>
-        </w:rPr>
-        <w:t>, law enforcement strategists and road safety analysts rely on detailed data to assess their current strategies; thus, the visualization enables these users to use it as a diagnostic tool to determine any gaps in automated enforcement compared with police presence.</w:t>
+        <w:t>Primary:</w:t>
+      </w:r>
+      <w:r>
+        <w:rPr>
+          <w:rFonts w:ascii="Times New Roman" w:hAnsi="Times New Roman" w:cs="Times New Roman"/>
+        </w:rPr>
+        <w:t xml:space="preserve"> Traffic policymakers, law enforcement strategists, and road safety analysts. They require a diagnostic tool to evaluate the balance between automated enforcement and targeted police deployment.</w:t>
       </w:r>
     </w:p>
     <w:p>
@@ -2129,13 +2090,13 @@
           <w:b/>
           <w:bCs/>
         </w:rPr>
-        <w:t>The public and data journalism organizations</w:t>
-      </w:r>
-      <w:r>
-        <w:rPr>
-          <w:rFonts w:ascii="Times New Roman" w:hAnsi="Times New Roman" w:cs="Times New Roman"/>
-        </w:rPr>
-        <w:t xml:space="preserve"> that are focused on holding the government accountable make up the secondary audience using this visualization; consequently, they have had their confusion concerning how traffic enforcement works, through transparent reporting of penalty numbers, changed to a clear, interactive story about who is being enforced against, where, and how.</w:t>
+        <w:t xml:space="preserve">Secondary: </w:t>
+      </w:r>
+      <w:r>
+        <w:rPr>
+          <w:rFonts w:ascii="Times New Roman" w:hAnsi="Times New Roman" w:cs="Times New Roman"/>
+        </w:rPr>
+        <w:t>The public and data journalism organizations focused on government accountability. They require transparent, interactive storytelling to understand who is being enforced against, where, and how.</w:t>
       </w:r>
     </w:p>
     <w:p>
@@ -2177,31 +2138,7 @@
         <w:rPr>
           <w:rFonts w:ascii="Times New Roman" w:hAnsi="Times New Roman" w:cs="Times New Roman"/>
         </w:rPr>
-        <w:t>This project attempts to alleviate the significant problem of</w:t>
-      </w:r>
-      <w:r>
-        <w:rPr>
-          <w:rFonts w:ascii="Times New Roman" w:hAnsi="Times New Roman" w:cs="Times New Roman"/>
-        </w:rPr>
-        <w:t xml:space="preserve"> “</w:t>
-      </w:r>
-      <w:r>
-        <w:rPr>
-          <w:rFonts w:ascii="Times New Roman" w:hAnsi="Times New Roman" w:cs="Times New Roman"/>
-        </w:rPr>
-        <w:t>enforcement opacity</w:t>
-      </w:r>
-      <w:r>
-        <w:rPr>
-          <w:rFonts w:ascii="Times New Roman" w:hAnsi="Times New Roman" w:cs="Times New Roman"/>
-        </w:rPr>
-        <w:t>”.</w:t>
-      </w:r>
-      <w:r>
-        <w:rPr>
-          <w:rFonts w:ascii="Times New Roman" w:hAnsi="Times New Roman" w:cs="Times New Roman"/>
-        </w:rPr>
-        <w:t xml:space="preserve"> Traditional dashboards just count the total number of fines issued; However, permit visualization allows us to visualize the context of enforcement, specifically the severity of the final outcome (fine vs. arrest). This is critical for measuring whether the use of automated cameras is producing only revenue, and if the manual intervention of the police effectively addresses high-risk and repeat offender behaviour.</w:t>
+        <w:t>“Enforcement opacity” is a problem this project aims to solve. Existing dashboard tools provide only an aggregated total penalty count. Through this data collection and visualization, the data will be provided with context, by identifying the severity of the outcome (fine or arrest). This is very important for determining if the automated cameras are being used, primarily as a revenue generating tool and whether manual intervention by police officers is adequate for dealing with high-risk behaviours and repeat offenders.</w:t>
       </w:r>
     </w:p>
     <w:p>
@@ -2249,7 +2186,7 @@
         <w:rPr>
           <w:rFonts w:ascii="Times New Roman" w:hAnsi="Times New Roman" w:cs="Times New Roman"/>
         </w:rPr>
-        <w:t>Contrast between the quantity of physically captured evidence recorded by cameras on an automated basis compared with the recorded occurrences of actual police officer actions including arrests or charges.</w:t>
+        <w:t>Contrast the volume of automated camera detections against actual police-issued actions (arrests/charges).</w:t>
       </w:r>
     </w:p>
     <w:p>
@@ -2269,7 +2206,7 @@
         <w:rPr>
           <w:rFonts w:ascii="Times New Roman" w:hAnsi="Times New Roman" w:cs="Times New Roman"/>
         </w:rPr>
-        <w:t>Identify specific demographic age groups most prone to receiving escalated levels of enforcement (such as being arrested) in comparison to just having to pay a monetary fine.</w:t>
+        <w:t>Identify specific demographic age groups most prone to receiving escalated enforcement (arrests) compared to monetary fines.</w:t>
       </w:r>
     </w:p>
     <w:p>
@@ -2289,7 +2226,7 @@
         <w:rPr>
           <w:rFonts w:ascii="Times New Roman" w:hAnsi="Times New Roman" w:cs="Times New Roman"/>
         </w:rPr>
-        <w:t>Investigate policing practices for the purpose of comparison on a geographic basis distinguishing between enforcement practices as an example based on geographical distance between major urban areas and remote areas within Australia.</w:t>
+        <w:t>Investigate geographic policing discrepancies (e.g., Major Cities vs. Remote areas).</w:t>
       </w:r>
     </w:p>
     <w:p>
@@ -2309,8 +2246,53 @@
         <w:rPr>
           <w:rFonts w:ascii="Times New Roman" w:hAnsi="Times New Roman" w:cs="Times New Roman"/>
         </w:rPr>
-        <w:t>Examine changes in temporal offenses for purpose of determining whether there are seasonal changes or longitudinal trends in driver behavior.</w:t>
-      </w:r>
+        <w:t>Examine temporal trends to determine seasonal or longitudinal shifts in enforcement strategies.</w:t>
+      </w:r>
+    </w:p>
+    <w:p>
+      <w:pPr>
+        <w:spacing w:line="360" w:lineRule="auto"/>
+        <w:jc w:val="both"/>
+        <w:rPr>
+          <w:rFonts w:ascii="Times New Roman" w:hAnsi="Times New Roman" w:cs="Times New Roman"/>
+        </w:rPr>
+      </w:pPr>
+    </w:p>
+    <w:p>
+      <w:pPr>
+        <w:spacing w:line="360" w:lineRule="auto"/>
+        <w:jc w:val="both"/>
+        <w:rPr>
+          <w:rFonts w:ascii="Times New Roman" w:hAnsi="Times New Roman" w:cs="Times New Roman"/>
+        </w:rPr>
+      </w:pPr>
+    </w:p>
+    <w:p>
+      <w:pPr>
+        <w:spacing w:line="360" w:lineRule="auto"/>
+        <w:jc w:val="both"/>
+        <w:rPr>
+          <w:rFonts w:ascii="Times New Roman" w:hAnsi="Times New Roman" w:cs="Times New Roman"/>
+        </w:rPr>
+      </w:pPr>
+    </w:p>
+    <w:p>
+      <w:pPr>
+        <w:spacing w:line="360" w:lineRule="auto"/>
+        <w:jc w:val="both"/>
+        <w:rPr>
+          <w:rFonts w:ascii="Times New Roman" w:hAnsi="Times New Roman" w:cs="Times New Roman"/>
+        </w:rPr>
+      </w:pPr>
+    </w:p>
+    <w:p>
+      <w:pPr>
+        <w:spacing w:line="360" w:lineRule="auto"/>
+        <w:jc w:val="both"/>
+        <w:rPr>
+          <w:rFonts w:ascii="Times New Roman" w:hAnsi="Times New Roman" w:cs="Times New Roman"/>
+        </w:rPr>
+      </w:pPr>
     </w:p>
     <w:p>
       <w:pPr>
@@ -2362,7 +2344,7 @@
         <w:rPr>
           <w:rFonts w:ascii="Times New Roman" w:hAnsi="Times New Roman" w:cs="Times New Roman"/>
         </w:rPr>
-        <w:t>Here is the overview of what questions will be able to be answered from the results/data of this visualisation</w:t>
+        <w:t>This visualization is designed to answer the following core questions, translating raw enforcement logs into actionable intelligence</w:t>
       </w:r>
       <w:r>
         <w:rPr>
@@ -2408,7 +2390,13 @@
         <w:rPr>
           <w:rFonts w:ascii="Times New Roman" w:hAnsi="Times New Roman" w:cs="Times New Roman"/>
         </w:rPr>
-        <w:t>For severe offences (e.g., unlicensed driving), what proportion results in standard fines versus arrests/charges? This reveals whether states are consistently enforcing laws or relying solely on financial penalties.</w:t>
+        <w:t>For</w:t>
+      </w:r>
+      <w:r>
+        <w:rPr>
+          <w:rFonts w:ascii="Times New Roman" w:hAnsi="Times New Roman" w:cs="Times New Roman"/>
+        </w:rPr>
+        <w:t xml:space="preserve"> severe offences (e.g., unlicensed driving), what proportion results in standard fines versus arrests/charges? This reveals whether states rely solely on financial penalties or actively pursue criminal deterrence.</w:t>
       </w:r>
     </w:p>
     <w:p>
@@ -2458,7 +2446,13 @@
         <w:rPr>
           <w:rFonts w:ascii="Times New Roman" w:hAnsi="Times New Roman" w:cs="Times New Roman"/>
         </w:rPr>
-        <w:t>Are younger demographics (17-25) over-represented in police-issued offences compared to automated camera detections? This identifies if cameras blindly penalize speed, while police specifically target high-risk age groups.</w:t>
+        <w:t>Are</w:t>
+      </w:r>
+      <w:r>
+        <w:rPr>
+          <w:rFonts w:ascii="Times New Roman" w:hAnsi="Times New Roman" w:cs="Times New Roman"/>
+        </w:rPr>
+        <w:t xml:space="preserve"> younger demographics (17-25) over-represented in police-issued offences compared to automated camera detections, indicating targeted policing of high-risk age groups?</w:t>
       </w:r>
     </w:p>
     <w:p>
@@ -2583,6 +2577,17 @@
           <w:bCs/>
         </w:rPr>
       </w:pPr>
+    </w:p>
+    <w:p>
+      <w:pPr>
+        <w:spacing w:after="0" w:line="360" w:lineRule="auto"/>
+        <w:jc w:val="both"/>
+        <w:rPr>
+          <w:rFonts w:ascii="Times New Roman" w:hAnsi="Times New Roman" w:cs="Times New Roman"/>
+          <w:b/>
+          <w:bCs/>
+        </w:rPr>
+      </w:pPr>
       <w:r>
         <w:rPr>
           <w:rFonts w:ascii="Times New Roman" w:hAnsi="Times New Roman" w:cs="Times New Roman"/>
@@ -2604,103 +2609,31 @@
         <w:rPr>
           <w:rFonts w:ascii="Times New Roman" w:hAnsi="Times New Roman" w:cs="Times New Roman"/>
         </w:rPr>
-        <w:t>By translating raw enforcement logs into an interactive, multi-dimensional interface, this visualization provides immediate, actionable intelligence. Policymakers can use it to justify resource allocation</w:t>
-      </w:r>
-      <w:r>
-        <w:rPr>
-          <w:rFonts w:ascii="Times New Roman" w:hAnsi="Times New Roman" w:cs="Times New Roman"/>
-        </w:rPr>
-        <w:t>. F</w:t>
-      </w:r>
-      <w:r>
-        <w:rPr>
-          <w:rFonts w:ascii="Times New Roman" w:hAnsi="Times New Roman" w:cs="Times New Roman"/>
-        </w:rPr>
-        <w:t xml:space="preserve">or instance, identifying regions where low camera coverage necessitates increased police patrols (Manual Actions). Furthermore, by explicitly visualizing </w:t>
-      </w:r>
-      <w:r>
-        <w:rPr>
-          <w:rFonts w:ascii="Times New Roman" w:hAnsi="Times New Roman" w:cs="Times New Roman"/>
-        </w:rPr>
-        <w:t>“</w:t>
-      </w:r>
-      <w:r>
-        <w:rPr>
-          <w:rFonts w:ascii="Times New Roman" w:hAnsi="Times New Roman" w:cs="Times New Roman"/>
-        </w:rPr>
-        <w:t>Arrests</w:t>
-      </w:r>
-      <w:r>
-        <w:rPr>
-          <w:rFonts w:ascii="Times New Roman" w:hAnsi="Times New Roman" w:cs="Times New Roman"/>
-        </w:rPr>
-        <w:t>”</w:t>
-      </w:r>
-      <w:r>
-        <w:rPr>
-          <w:rFonts w:ascii="Times New Roman" w:hAnsi="Times New Roman" w:cs="Times New Roman"/>
-        </w:rPr>
-        <w:t xml:space="preserve"> and </w:t>
-      </w:r>
-      <w:r>
-        <w:rPr>
-          <w:rFonts w:ascii="Times New Roman" w:hAnsi="Times New Roman" w:cs="Times New Roman"/>
-        </w:rPr>
-        <w:t>“</w:t>
-      </w:r>
-      <w:r>
-        <w:rPr>
-          <w:rFonts w:ascii="Times New Roman" w:hAnsi="Times New Roman" w:cs="Times New Roman"/>
-        </w:rPr>
-        <w:t>Charges</w:t>
-      </w:r>
-      <w:r>
-        <w:rPr>
-          <w:rFonts w:ascii="Times New Roman" w:hAnsi="Times New Roman" w:cs="Times New Roman"/>
-        </w:rPr>
-        <w:t>”</w:t>
-      </w:r>
-      <w:r>
-        <w:rPr>
-          <w:rFonts w:ascii="Times New Roman" w:hAnsi="Times New Roman" w:cs="Times New Roman"/>
-        </w:rPr>
-        <w:t xml:space="preserve"> a</w:t>
-      </w:r>
-      <w:r>
-        <w:rPr>
-          <w:rFonts w:ascii="Times New Roman" w:hAnsi="Times New Roman" w:cs="Times New Roman"/>
-        </w:rPr>
-        <w:t>nd</w:t>
-      </w:r>
-      <w:r>
-        <w:rPr>
-          <w:rFonts w:ascii="Times New Roman" w:hAnsi="Times New Roman" w:cs="Times New Roman"/>
-        </w:rPr>
-        <w:t xml:space="preserve"> </w:t>
-      </w:r>
-      <w:r>
-        <w:rPr>
-          <w:rFonts w:ascii="Times New Roman" w:hAnsi="Times New Roman" w:cs="Times New Roman"/>
-        </w:rPr>
-        <w:t>“</w:t>
-      </w:r>
-      <w:r>
-        <w:rPr>
-          <w:rFonts w:ascii="Times New Roman" w:hAnsi="Times New Roman" w:cs="Times New Roman"/>
-        </w:rPr>
-        <w:t>Fines</w:t>
-      </w:r>
-      <w:r>
-        <w:rPr>
-          <w:rFonts w:ascii="Times New Roman" w:hAnsi="Times New Roman" w:cs="Times New Roman"/>
-        </w:rPr>
-        <w:t xml:space="preserve">”, </w:t>
-      </w:r>
-      <w:r>
-        <w:rPr>
-          <w:rFonts w:ascii="Times New Roman" w:hAnsi="Times New Roman" w:cs="Times New Roman"/>
-        </w:rPr>
-        <w:t>the dashboard actively shifts the policy narrative away from revenue generation and toward genuine crime deterrence and behavioural change, ultimately supporting more effective road safety strategies.</w:t>
+        <w:t>By explicitly visualizing “Arrests” and “Charges” alongside “Fines”, this dashboard actively shifts the policy narrative away from revenue generation and toward genuine crime deterrence. Policymakers can use this interface to justify resource allocation</w:t>
+      </w:r>
+      <w:r>
+        <w:rPr>
+          <w:rFonts w:ascii="Times New Roman" w:hAnsi="Times New Roman" w:cs="Times New Roman"/>
+        </w:rPr>
+        <w:t xml:space="preserve">, </w:t>
+      </w:r>
+      <w:r>
+        <w:rPr>
+          <w:rFonts w:ascii="Times New Roman" w:hAnsi="Times New Roman" w:cs="Times New Roman"/>
+        </w:rPr>
+        <w:t>for instance, identifying regions where low camera coverage necessitates increased police patrols</w:t>
+      </w:r>
+      <w:r>
+        <w:rPr>
+          <w:rFonts w:ascii="Times New Roman" w:hAnsi="Times New Roman" w:cs="Times New Roman"/>
+        </w:rPr>
+        <w:t xml:space="preserve">, it is </w:t>
+      </w:r>
+      <w:r>
+        <w:rPr>
+          <w:rFonts w:ascii="Times New Roman" w:hAnsi="Times New Roman" w:cs="Times New Roman"/>
+        </w:rPr>
+        <w:t>ultimately supporting more effective, behaviour-focused road safety strategies.</w:t>
       </w:r>
     </w:p>
     <w:p>
@@ -3578,87 +3511,116 @@
           <w:bCs/>
         </w:rPr>
         <w:lastRenderedPageBreak/>
-        <w:t>Data Collection Process:</w:t>
-      </w:r>
-    </w:p>
-    <w:p>
-      <w:pPr>
-        <w:spacing w:after="0" w:line="360" w:lineRule="auto"/>
-        <w:jc w:val="both"/>
-        <w:rPr>
-          <w:rFonts w:ascii="Times New Roman" w:hAnsi="Times New Roman" w:cs="Times New Roman"/>
-        </w:rPr>
-      </w:pPr>
-      <w:r>
-        <w:rPr>
-          <w:rFonts w:ascii="Times New Roman" w:hAnsi="Times New Roman" w:cs="Times New Roman"/>
-        </w:rPr>
-        <w:t>The data is collected by state and territory police forces and transport authorities (e.g., NSW Police, VIC Police). It is then aggregated by BITRE to provide a standardized national view. Since 2023, BITRE updated their collection methods to include fine-grained dimensions</w:t>
-      </w:r>
-      <w:r>
-        <w:rPr>
-          <w:rFonts w:ascii="Times New Roman" w:hAnsi="Times New Roman" w:cs="Times New Roman"/>
-        </w:rPr>
-        <w:t xml:space="preserve">, </w:t>
-      </w:r>
-      <w:r>
-        <w:rPr>
-          <w:rFonts w:ascii="Times New Roman" w:hAnsi="Times New Roman" w:cs="Times New Roman"/>
-        </w:rPr>
-        <w:t>specifically breaking down penalties by age group, precise geographical classifications (e.g., Major Cities vs. Remote Australia), and enforcement severity (fines vs. arrests).</w:t>
-      </w:r>
-    </w:p>
-    <w:p>
-      <w:pPr>
-        <w:spacing w:after="0" w:line="360" w:lineRule="auto"/>
-        <w:jc w:val="both"/>
-        <w:rPr>
-          <w:rFonts w:ascii="Times New Roman" w:hAnsi="Times New Roman" w:cs="Times New Roman"/>
-          <w:b/>
-          <w:bCs/>
-        </w:rPr>
-      </w:pPr>
-    </w:p>
-    <w:p>
-      <w:pPr>
-        <w:spacing w:after="0" w:line="360" w:lineRule="auto"/>
-        <w:jc w:val="both"/>
-        <w:rPr>
-          <w:rFonts w:ascii="Times New Roman" w:hAnsi="Times New Roman" w:cs="Times New Roman"/>
-          <w:b/>
-          <w:bCs/>
-        </w:rPr>
-      </w:pPr>
-      <w:r>
-        <w:rPr>
-          <w:rFonts w:ascii="Times New Roman" w:hAnsi="Times New Roman" w:cs="Times New Roman"/>
-          <w:b/>
-          <w:bCs/>
-        </w:rPr>
-        <w:t>Data Quality Assessment:</w:t>
-      </w:r>
-    </w:p>
-    <w:p>
-      <w:pPr>
-        <w:spacing w:after="0" w:line="360" w:lineRule="auto"/>
-        <w:jc w:val="both"/>
-        <w:rPr>
-          <w:rFonts w:ascii="Times New Roman" w:hAnsi="Times New Roman" w:cs="Times New Roman"/>
-        </w:rPr>
-      </w:pPr>
-      <w:r>
-        <w:rPr>
-          <w:rFonts w:ascii="Times New Roman" w:hAnsi="Times New Roman" w:cs="Times New Roman"/>
-        </w:rPr>
-        <w:t>The dataset was originally profiled through the KNIME Statistics Node. In our initial observations of this dataset, we found that there were no traditional NULL values. However, this does not mean that the data contained no problems. Severe issues with data quality presented themselves through mislabeled categorical values (e.g., Tasmania groups fixed and mobile camera images while other jurisdictions disaggregate them), as well as missing contextual data represented as strings (e.g., "Unknown" for age and location). Rather than treating these items as dirty data, they were identified as valid "aggregate" or "undefined" categories and needed further semantic remapping to avoid incorrect mathematical aggregation.</w:t>
-      </w:r>
-    </w:p>
-    <w:p>
-      <w:pPr>
-        <w:spacing w:after="0" w:line="360" w:lineRule="auto"/>
-        <w:jc w:val="both"/>
-        <w:rPr>
-          <w:rFonts w:ascii="Times New Roman" w:hAnsi="Times New Roman" w:cs="Times New Roman"/>
+        <w:t>Data Collection &amp; Quality Assessment:</w:t>
+      </w:r>
+    </w:p>
+    <w:p>
+      <w:pPr>
+        <w:spacing w:after="0" w:line="360" w:lineRule="auto"/>
+        <w:jc w:val="both"/>
+        <w:rPr>
+          <w:rFonts w:ascii="Times New Roman" w:hAnsi="Times New Roman" w:cs="Times New Roman"/>
+        </w:rPr>
+      </w:pPr>
+      <w:r>
+        <w:rPr>
+          <w:rFonts w:ascii="Times New Roman" w:hAnsi="Times New Roman" w:cs="Times New Roman"/>
+        </w:rPr>
+        <w:t xml:space="preserve">The data is collected by state and territory police forces (e.g., NSW Police, VIC Police) and aggregated by BITRE to provide a standardized national view. Initial profiling via the KNIME Statistics Node revealed zero traditional NULL values. However, severe data quality issues presented themselves through </w:t>
+      </w:r>
+      <w:r>
+        <w:rPr>
+          <w:rFonts w:ascii="Times New Roman" w:hAnsi="Times New Roman" w:cs="Times New Roman"/>
+        </w:rPr>
+        <w:t>mislabelled</w:t>
+      </w:r>
+      <w:r>
+        <w:rPr>
+          <w:rFonts w:ascii="Times New Roman" w:hAnsi="Times New Roman" w:cs="Times New Roman"/>
+        </w:rPr>
+        <w:t xml:space="preserve"> categorical values (e.g., Tasmania aggregates fixed and mobile camera data while other jurisdictions disaggregate them) and missing contextual data represented as strings (e.g., </w:t>
+      </w:r>
+      <w:r>
+        <w:rPr>
+          <w:rFonts w:ascii="Times New Roman" w:hAnsi="Times New Roman" w:cs="Times New Roman"/>
+        </w:rPr>
+        <w:t>“</w:t>
+      </w:r>
+      <w:r>
+        <w:rPr>
+          <w:rFonts w:ascii="Times New Roman" w:hAnsi="Times New Roman" w:cs="Times New Roman"/>
+        </w:rPr>
+        <w:t>Unknown</w:t>
+      </w:r>
+      <w:r>
+        <w:rPr>
+          <w:rFonts w:ascii="Times New Roman" w:hAnsi="Times New Roman" w:cs="Times New Roman"/>
+        </w:rPr>
+        <w:t>”</w:t>
+      </w:r>
+      <w:r>
+        <w:rPr>
+          <w:rFonts w:ascii="Times New Roman" w:hAnsi="Times New Roman" w:cs="Times New Roman"/>
+        </w:rPr>
+        <w:t xml:space="preserve"> for age and location). Rather than treating these as dirty data, they were identified as valid </w:t>
+      </w:r>
+      <w:r>
+        <w:rPr>
+          <w:rFonts w:ascii="Times New Roman" w:hAnsi="Times New Roman" w:cs="Times New Roman"/>
+        </w:rPr>
+        <w:t>“</w:t>
+      </w:r>
+      <w:r>
+        <w:rPr>
+          <w:rFonts w:ascii="Times New Roman" w:hAnsi="Times New Roman" w:cs="Times New Roman"/>
+        </w:rPr>
+        <w:t>aggregate</w:t>
+      </w:r>
+      <w:r>
+        <w:rPr>
+          <w:rFonts w:ascii="Times New Roman" w:hAnsi="Times New Roman" w:cs="Times New Roman"/>
+        </w:rPr>
+        <w:t>”</w:t>
+      </w:r>
+      <w:r>
+        <w:rPr>
+          <w:rFonts w:ascii="Times New Roman" w:hAnsi="Times New Roman" w:cs="Times New Roman"/>
+        </w:rPr>
+        <w:t xml:space="preserve"> or </w:t>
+      </w:r>
+      <w:r>
+        <w:rPr>
+          <w:rFonts w:ascii="Times New Roman" w:hAnsi="Times New Roman" w:cs="Times New Roman"/>
+        </w:rPr>
+        <w:t>“</w:t>
+      </w:r>
+      <w:r>
+        <w:rPr>
+          <w:rFonts w:ascii="Times New Roman" w:hAnsi="Times New Roman" w:cs="Times New Roman"/>
+        </w:rPr>
+        <w:t>undefined</w:t>
+      </w:r>
+      <w:r>
+        <w:rPr>
+          <w:rFonts w:ascii="Times New Roman" w:hAnsi="Times New Roman" w:cs="Times New Roman"/>
+        </w:rPr>
+        <w:t>”</w:t>
+      </w:r>
+      <w:r>
+        <w:rPr>
+          <w:rFonts w:ascii="Times New Roman" w:hAnsi="Times New Roman" w:cs="Times New Roman"/>
+        </w:rPr>
+        <w:t xml:space="preserve"> categories requiring semantic remapping to prevent incorrect mathematical aggregation.</w:t>
+      </w:r>
+    </w:p>
+    <w:p>
+      <w:pPr>
+        <w:spacing w:after="0" w:line="360" w:lineRule="auto"/>
+        <w:jc w:val="both"/>
+        <w:rPr>
+          <w:rFonts w:ascii="Times New Roman" w:hAnsi="Times New Roman" w:cs="Times New Roman"/>
+          <w:b/>
+          <w:bCs/>
         </w:rPr>
       </w:pPr>
     </w:p>
@@ -3693,51 +3655,116 @@
         <w:rPr>
           <w:rFonts w:ascii="Times New Roman" w:hAnsi="Times New Roman" w:cs="Times New Roman"/>
         </w:rPr>
-        <w:t>Because the dataset is highly aggregated, there is no Personally Identifiable Information (PII) such as names, license plate numbers, or exact street addresses. The lowest level of granularity is age group and broad geographical region. Ethically, no individual can be identified from this dataset, making it fully compliant with privacy regulations. The data is used strictly for aggregate trend analysis and visualization.</w:t>
-      </w:r>
-    </w:p>
-    <w:p>
-      <w:pPr>
-        <w:spacing w:after="0" w:line="360" w:lineRule="auto"/>
-        <w:jc w:val="both"/>
-        <w:rPr>
-          <w:rFonts w:ascii="Times New Roman" w:hAnsi="Times New Roman" w:cs="Times New Roman"/>
-        </w:rPr>
-      </w:pPr>
-    </w:p>
-    <w:p>
-      <w:pPr>
-        <w:spacing w:after="0" w:line="360" w:lineRule="auto"/>
-        <w:jc w:val="both"/>
-        <w:rPr>
-          <w:rFonts w:ascii="Times New Roman" w:hAnsi="Times New Roman" w:cs="Times New Roman"/>
-          <w:b/>
-          <w:bCs/>
-        </w:rPr>
-      </w:pPr>
-      <w:r>
-        <w:rPr>
-          <w:rFonts w:ascii="Times New Roman" w:hAnsi="Times New Roman" w:cs="Times New Roman"/>
-          <w:b/>
-          <w:bCs/>
-        </w:rPr>
-        <w:t>Alignment with Section 1.2 Questions:</w:t>
-      </w:r>
-    </w:p>
-    <w:p>
-      <w:pPr>
-        <w:spacing w:after="0" w:line="360" w:lineRule="auto"/>
-        <w:jc w:val="both"/>
-        <w:rPr>
-          <w:rFonts w:ascii="Times New Roman" w:hAnsi="Times New Roman" w:cs="Times New Roman"/>
-        </w:rPr>
-      </w:pPr>
-      <w:r>
-        <w:rPr>
-          <w:rFonts w:ascii="Times New Roman" w:hAnsi="Times New Roman" w:cs="Times New Roman"/>
-        </w:rPr>
-        <w:t>This dataset directly answers our core questions: Severity Distribution (by cross-referencing FINES with ARRESTS), Demographic Targeting (via the AGE_GROUP column), and Geographic Discrepancy (via the LOCATION column). It transforms basic penalty counts into a narrative about who is being policed, where, and how severely they are penalized.</w:t>
-      </w:r>
+        <w:t>Because the dataset is highly aggregated, there is no Personally Identifiable Information (PII) such as names, license plates, or exact addresses. The lowest level of granularity is age group and broad geographical region. Ethically, no individual can be identified from this dataset, making it fully compliant with Australian Privacy Principles (APPs). The data is used strictly for aggregate trend analysis.</w:t>
+      </w:r>
+    </w:p>
+    <w:p>
+      <w:pPr>
+        <w:spacing w:after="0" w:line="360" w:lineRule="auto"/>
+        <w:jc w:val="both"/>
+        <w:rPr>
+          <w:rFonts w:ascii="Times New Roman" w:hAnsi="Times New Roman" w:cs="Times New Roman"/>
+          <w:b/>
+          <w:bCs/>
+        </w:rPr>
+      </w:pPr>
+    </w:p>
+    <w:p>
+      <w:pPr>
+        <w:spacing w:after="0" w:line="360" w:lineRule="auto"/>
+        <w:jc w:val="both"/>
+        <w:rPr>
+          <w:rFonts w:ascii="Times New Roman" w:hAnsi="Times New Roman" w:cs="Times New Roman"/>
+          <w:b/>
+          <w:bCs/>
+        </w:rPr>
+      </w:pPr>
+      <w:r>
+        <w:rPr>
+          <w:rFonts w:ascii="Times New Roman" w:hAnsi="Times New Roman" w:cs="Times New Roman"/>
+          <w:b/>
+          <w:bCs/>
+        </w:rPr>
+        <w:t>Alignment with Section 1.2:</w:t>
+      </w:r>
+    </w:p>
+    <w:p>
+      <w:pPr>
+        <w:spacing w:after="0" w:line="360" w:lineRule="auto"/>
+        <w:jc w:val="both"/>
+        <w:rPr>
+          <w:rFonts w:ascii="Times New Roman" w:hAnsi="Times New Roman" w:cs="Times New Roman"/>
+        </w:rPr>
+      </w:pPr>
+      <w:r>
+        <w:rPr>
+          <w:rFonts w:ascii="Times New Roman" w:hAnsi="Times New Roman" w:cs="Times New Roman"/>
+        </w:rPr>
+        <w:t>This dataset directly answers our core questions: Severity Distribution (by cross-referencing FINES with ARRESTS), Demographic Targeting (via the AGE_GROUP column), and Geographic Discrepancy (via the LOCATION column).</w:t>
+      </w:r>
+    </w:p>
+    <w:p>
+      <w:pPr>
+        <w:spacing w:after="0" w:line="360" w:lineRule="auto"/>
+        <w:jc w:val="both"/>
+        <w:rPr>
+          <w:rFonts w:ascii="Times New Roman" w:hAnsi="Times New Roman" w:cs="Times New Roman"/>
+        </w:rPr>
+      </w:pPr>
+    </w:p>
+    <w:p>
+      <w:pPr>
+        <w:spacing w:after="0" w:line="360" w:lineRule="auto"/>
+        <w:jc w:val="both"/>
+        <w:rPr>
+          <w:rFonts w:ascii="Times New Roman" w:hAnsi="Times New Roman" w:cs="Times New Roman"/>
+        </w:rPr>
+      </w:pPr>
+    </w:p>
+    <w:p>
+      <w:pPr>
+        <w:spacing w:after="0" w:line="360" w:lineRule="auto"/>
+        <w:jc w:val="both"/>
+        <w:rPr>
+          <w:rFonts w:ascii="Times New Roman" w:hAnsi="Times New Roman" w:cs="Times New Roman"/>
+        </w:rPr>
+      </w:pPr>
+    </w:p>
+    <w:p>
+      <w:pPr>
+        <w:spacing w:after="0" w:line="360" w:lineRule="auto"/>
+        <w:jc w:val="both"/>
+        <w:rPr>
+          <w:rFonts w:ascii="Times New Roman" w:hAnsi="Times New Roman" w:cs="Times New Roman"/>
+        </w:rPr>
+      </w:pPr>
+    </w:p>
+    <w:p>
+      <w:pPr>
+        <w:spacing w:after="0" w:line="360" w:lineRule="auto"/>
+        <w:jc w:val="both"/>
+        <w:rPr>
+          <w:rFonts w:ascii="Times New Roman" w:hAnsi="Times New Roman" w:cs="Times New Roman"/>
+        </w:rPr>
+      </w:pPr>
+    </w:p>
+    <w:p>
+      <w:pPr>
+        <w:spacing w:after="0" w:line="360" w:lineRule="auto"/>
+        <w:jc w:val="both"/>
+        <w:rPr>
+          <w:rFonts w:ascii="Times New Roman" w:hAnsi="Times New Roman" w:cs="Times New Roman"/>
+        </w:rPr>
+      </w:pPr>
+    </w:p>
+    <w:p>
+      <w:pPr>
+        <w:spacing w:after="0" w:line="360" w:lineRule="auto"/>
+        <w:jc w:val="both"/>
+        <w:rPr>
+          <w:rFonts w:ascii="Times New Roman" w:hAnsi="Times New Roman" w:cs="Times New Roman"/>
+        </w:rPr>
+      </w:pPr>
     </w:p>
     <w:p>
       <w:pPr>
@@ -3841,13 +3868,13 @@
         <w:rPr>
           <w:rFonts w:ascii="Times New Roman" w:hAnsi="Times New Roman" w:cs="Times New Roman"/>
         </w:rPr>
-        <w:t xml:space="preserve"> JURISDICTION (e.g., NSW, VIC, QLD), METRIC (e.g., mobile_phone_use, unlicensed_driving), DETECTION_METHOD (e.g., Police issued</w:t>
-      </w:r>
-      <w:r>
-        <w:rPr>
-          <w:rFonts w:ascii="Times New Roman" w:hAnsi="Times New Roman" w:cs="Times New Roman"/>
-        </w:rPr>
-        <w:t>)</w:t>
+        <w:t xml:space="preserve"> </w:t>
+      </w:r>
+      <w:r>
+        <w:rPr>
+          <w:rFonts w:ascii="Times New Roman" w:hAnsi="Times New Roman" w:cs="Times New Roman"/>
+        </w:rPr>
+        <w:t>JURISDICTION, METRIC, DETECTION_METHOD.</w:t>
       </w:r>
     </w:p>
     <w:p>
@@ -3903,7 +3930,13 @@
         <w:rPr>
           <w:rFonts w:ascii="Times New Roman" w:hAnsi="Times New Roman" w:cs="Times New Roman"/>
         </w:rPr>
-        <w:t xml:space="preserve"> FINES, ARRESTS, CHARGES. Represent counts of enforcement actions (no continuous ratio data like percentages).</w:t>
+        <w:t xml:space="preserve"> </w:t>
+      </w:r>
+      <w:r>
+        <w:rPr>
+          <w:rFonts w:ascii="Times New Roman" w:hAnsi="Times New Roman" w:cs="Times New Roman"/>
+        </w:rPr>
+        <w:t>FINES, ARRESTS, CHARGES (representing counts, no continuous ratios).</w:t>
       </w:r>
     </w:p>
     <w:p>
@@ -3946,7 +3979,13 @@
         <w:rPr>
           <w:rFonts w:ascii="Times New Roman" w:hAnsi="Times New Roman" w:cs="Times New Roman"/>
         </w:rPr>
-        <w:t>To ensure absolute data integrity without artificially deleting any of the 12,179 rows, the cleaning process focused on Semantic Recoding rather than row filtration:</w:t>
+        <w:t>To</w:t>
+      </w:r>
+      <w:r>
+        <w:rPr>
+          <w:rFonts w:ascii="Times New Roman" w:hAnsi="Times New Roman" w:cs="Times New Roman"/>
+        </w:rPr>
+        <w:t xml:space="preserve"> ensure absolute data integrity without artificially deleting any of the 12,179 rows, cleaning focused on Semantic Recoding rather than row filtration:</w:t>
       </w:r>
     </w:p>
     <w:p>
@@ -3954,7 +3993,7 @@
         <w:pStyle w:val="ListParagraph"/>
         <w:numPr>
           <w:ilvl w:val="0"/>
-          <w:numId w:val="13"/>
+          <w:numId w:val="17"/>
         </w:numPr>
         <w:spacing w:after="0" w:line="360" w:lineRule="auto"/>
         <w:jc w:val="both"/>
@@ -3964,167 +4003,77 @@
       </w:pPr>
       <w:r>
         <w:rPr>
-          <w:rFonts w:ascii="Times New Roman" w:hAnsi="Times New Roman" w:cs="Times New Roman"/>
-          <w:b/>
-          <w:bCs/>
-        </w:rPr>
-        <w:t>Handling Missing/Unnamed Values:</w:t>
-      </w:r>
-      <w:r>
-        <w:rPr>
-          <w:rFonts w:ascii="Times New Roman" w:hAnsi="Times New Roman" w:cs="Times New Roman"/>
-        </w:rPr>
-        <w:t xml:space="preserve"> We did not filter out rows containing </w:t>
-      </w:r>
-      <w:r>
-        <w:rPr>
-          <w:rFonts w:ascii="Times New Roman" w:hAnsi="Times New Roman" w:cs="Times New Roman"/>
-          <w:b/>
-          <w:bCs/>
+          <w:rFonts w:ascii="Times New Roman" w:hAnsi="Times New Roman" w:cs="Times New Roman" w:hint="eastAsia"/>
+          <w:b/>
+          <w:bCs/>
+        </w:rPr>
+        <w:t xml:space="preserve">Handling Missing Values: </w:t>
+      </w:r>
+      <w:r>
+        <w:rPr>
+          <w:rFonts w:ascii="Times New Roman" w:hAnsi="Times New Roman" w:cs="Times New Roman" w:hint="eastAsia"/>
+        </w:rPr>
+        <w:t xml:space="preserve">String Replacer nodes mapped </w:t>
+      </w:r>
+      <w:r>
+        <w:rPr>
+          <w:rFonts w:ascii="Times New Roman" w:hAnsi="Times New Roman" w:cs="Times New Roman"/>
         </w:rPr>
         <w:t>“</w:t>
       </w:r>
       <w:r>
         <w:rPr>
-          <w:rFonts w:ascii="Times New Roman" w:hAnsi="Times New Roman" w:cs="Times New Roman"/>
-          <w:b/>
-          <w:bCs/>
+          <w:rFonts w:ascii="Times New Roman" w:hAnsi="Times New Roman" w:cs="Times New Roman" w:hint="eastAsia"/>
         </w:rPr>
         <w:t>Unknown</w:t>
       </w:r>
       <w:r>
         <w:rPr>
           <w:rFonts w:ascii="Times New Roman" w:hAnsi="Times New Roman" w:cs="Times New Roman"/>
-          <w:b/>
-          <w:bCs/>
         </w:rPr>
         <w:t>”</w:t>
       </w:r>
       <w:r>
         <w:rPr>
-          <w:rFonts w:ascii="Times New Roman" w:hAnsi="Times New Roman" w:cs="Times New Roman"/>
-        </w:rPr>
-        <w:t>. Instead, we implemented a series of String Replacer nodes to map them to analytical constants:</w:t>
-      </w:r>
-    </w:p>
-    <w:p>
-      <w:pPr>
-        <w:pStyle w:val="ListParagraph"/>
-        <w:numPr>
-          <w:ilvl w:val="1"/>
-          <w:numId w:val="13"/>
-        </w:numPr>
-        <w:spacing w:after="0" w:line="360" w:lineRule="auto"/>
-        <w:jc w:val="both"/>
-        <w:rPr>
-          <w:rFonts w:ascii="Times New Roman" w:hAnsi="Times New Roman" w:cs="Times New Roman"/>
-        </w:rPr>
-      </w:pPr>
-      <w:r>
-        <w:rPr>
           <w:rFonts w:ascii="Times New Roman" w:hAnsi="Times New Roman" w:cs="Times New Roman" w:hint="eastAsia"/>
-          <w:b/>
-          <w:bCs/>
-        </w:rPr>
-        <w:t>Unknown (Location)</w:t>
+        </w:rPr>
+        <w:t xml:space="preserve"> to analytical constants: Unknown (Location) </w:t>
       </w:r>
       <w:r>
         <w:rPr>
           <w:rFonts w:ascii="Times New Roman" w:hAnsi="Times New Roman" w:cs="Times New Roman" w:hint="eastAsia"/>
         </w:rPr>
-        <w:t xml:space="preserve"> </w:t>
+        <w:t>→</w:t>
       </w:r>
       <w:r>
         <w:rPr>
           <w:rFonts w:ascii="Times New Roman" w:hAnsi="Times New Roman" w:cs="Times New Roman" w:hint="eastAsia"/>
         </w:rPr>
+        <w:t xml:space="preserve"> All Regions, Unknown (Age) </w:t>
+      </w:r>
+      <w:r>
+        <w:rPr>
+          <w:rFonts w:ascii="Times New Roman" w:hAnsi="Times New Roman" w:cs="Times New Roman" w:hint="eastAsia"/>
+        </w:rPr>
         <w:t>→</w:t>
       </w:r>
       <w:r>
         <w:rPr>
           <w:rFonts w:ascii="Times New Roman" w:hAnsi="Times New Roman" w:cs="Times New Roman" w:hint="eastAsia"/>
         </w:rPr>
-        <w:t xml:space="preserve"> All Regions (Indicates aggregated data, likely from cameras lacking GPS).</w:t>
-      </w:r>
-    </w:p>
-    <w:p>
-      <w:pPr>
-        <w:pStyle w:val="ListParagraph"/>
-        <w:numPr>
-          <w:ilvl w:val="1"/>
-          <w:numId w:val="13"/>
-        </w:numPr>
-        <w:spacing w:after="0" w:line="360" w:lineRule="auto"/>
-        <w:jc w:val="both"/>
-        <w:rPr>
-          <w:rFonts w:ascii="Times New Roman" w:hAnsi="Times New Roman" w:cs="Times New Roman"/>
-        </w:rPr>
-      </w:pPr>
+        <w:t xml:space="preserve"> All Ages, Unknown (Method) </w:t>
+      </w:r>
       <w:r>
         <w:rPr>
           <w:rFonts w:ascii="Times New Roman" w:hAnsi="Times New Roman" w:cs="Times New Roman" w:hint="eastAsia"/>
-          <w:b/>
-          <w:bCs/>
-        </w:rPr>
-        <w:t>Unknown (Age)</w:t>
+        </w:rPr>
+        <w:t>→</w:t>
       </w:r>
       <w:r>
         <w:rPr>
           <w:rFonts w:ascii="Times New Roman" w:hAnsi="Times New Roman" w:cs="Times New Roman" w:hint="eastAsia"/>
         </w:rPr>
-        <w:t xml:space="preserve"> </w:t>
-      </w:r>
-      <w:r>
-        <w:rPr>
-          <w:rFonts w:ascii="Times New Roman" w:hAnsi="Times New Roman" w:cs="Times New Roman" w:hint="eastAsia"/>
-        </w:rPr>
-        <w:t>→</w:t>
-      </w:r>
-      <w:r>
-        <w:rPr>
-          <w:rFonts w:ascii="Times New Roman" w:hAnsi="Times New Roman" w:cs="Times New Roman" w:hint="eastAsia"/>
-        </w:rPr>
-        <w:t xml:space="preserve"> All Ages (Standardized demographic placeholder).</w:t>
-      </w:r>
-    </w:p>
-    <w:p>
-      <w:pPr>
-        <w:pStyle w:val="ListParagraph"/>
-        <w:numPr>
-          <w:ilvl w:val="1"/>
-          <w:numId w:val="13"/>
-        </w:numPr>
-        <w:spacing w:after="0" w:line="360" w:lineRule="auto"/>
-        <w:jc w:val="both"/>
-        <w:rPr>
-          <w:rFonts w:ascii="Times New Roman" w:hAnsi="Times New Roman" w:cs="Times New Roman"/>
-        </w:rPr>
-      </w:pPr>
-      <w:r>
-        <w:rPr>
-          <w:rFonts w:ascii="Times New Roman" w:hAnsi="Times New Roman" w:cs="Times New Roman" w:hint="eastAsia"/>
-          <w:b/>
-          <w:bCs/>
-        </w:rPr>
-        <w:t>Unknown (Method)</w:t>
-      </w:r>
-      <w:r>
-        <w:rPr>
-          <w:rFonts w:ascii="Times New Roman" w:hAnsi="Times New Roman" w:cs="Times New Roman" w:hint="eastAsia"/>
-        </w:rPr>
-        <w:t xml:space="preserve"> </w:t>
-      </w:r>
-      <w:r>
-        <w:rPr>
-          <w:rFonts w:ascii="Times New Roman" w:hAnsi="Times New Roman" w:cs="Times New Roman" w:hint="eastAsia"/>
-        </w:rPr>
-        <w:t>→</w:t>
-      </w:r>
-      <w:r>
-        <w:rPr>
-          <w:rFonts w:ascii="Times New Roman" w:hAnsi="Times New Roman" w:cs="Times New Roman" w:hint="eastAsia"/>
-        </w:rPr>
-        <w:t xml:space="preserve"> All Methods (Administrative omission in data entry).</w:t>
+        <w:t xml:space="preserve"> All Methods. This preserves total counts while preventing erroneous aggregation.</w:t>
       </w:r>
     </w:p>
     <w:p>
@@ -4132,7 +4081,7 @@
         <w:pStyle w:val="ListParagraph"/>
         <w:numPr>
           <w:ilvl w:val="0"/>
-          <w:numId w:val="13"/>
+          <w:numId w:val="17"/>
         </w:numPr>
         <w:spacing w:after="0" w:line="360" w:lineRule="auto"/>
         <w:jc w:val="both"/>
@@ -4146,13 +4095,13 @@
           <w:b/>
           <w:bCs/>
         </w:rPr>
-        <w:t>Removing Duplicates:</w:t>
-      </w:r>
-      <w:r>
-        <w:rPr>
-          <w:rFonts w:ascii="Times New Roman" w:hAnsi="Times New Roman" w:cs="Times New Roman"/>
-        </w:rPr>
-        <w:t xml:space="preserve"> Not applicable. The dataset represents pre-aggregated counts by state, location, age, metric, and method, inherently containing no exact duplicate rows.</w:t>
+        <w:t>Normalisation:</w:t>
+      </w:r>
+      <w:r>
+        <w:rPr>
+          <w:rFonts w:ascii="Times New Roman" w:hAnsi="Times New Roman" w:cs="Times New Roman"/>
+        </w:rPr>
+        <w:t xml:space="preserve"> The START_DATE string (e.g., 2024/1/1) was manipulated to extract a clean, discrete MONTH variable, converting raw strings into a numerical dimension to reduce front-end rendering payload.</w:t>
       </w:r>
     </w:p>
     <w:p>
@@ -4160,7 +4109,7 @@
         <w:pStyle w:val="ListParagraph"/>
         <w:numPr>
           <w:ilvl w:val="0"/>
-          <w:numId w:val="13"/>
+          <w:numId w:val="17"/>
         </w:numPr>
         <w:spacing w:after="0" w:line="360" w:lineRule="auto"/>
         <w:jc w:val="both"/>
@@ -4174,70 +4123,170 @@
           <w:b/>
           <w:bCs/>
         </w:rPr>
-        <w:t>Normalisation &amp; Transformation:</w:t>
-      </w:r>
-      <w:r>
-        <w:rPr>
-          <w:rFonts w:ascii="Times New Roman" w:hAnsi="Times New Roman" w:cs="Times New Roman"/>
-        </w:rPr>
-        <w:t xml:space="preserve"> The START_DATE column contained string timestamps (e.g., 2024/1/1). A String Manipulation node was used to extract a clean, discrete MONTH variable, converting the raw string into a numerical dimension for accurate time-series aggregation without bloating the front-end payload.</w:t>
-      </w:r>
-    </w:p>
-    <w:p>
-      <w:pPr>
-        <w:pStyle w:val="ListParagraph"/>
-        <w:numPr>
-          <w:ilvl w:val="0"/>
-          <w:numId w:val="13"/>
-        </w:numPr>
-        <w:spacing w:after="0" w:line="360" w:lineRule="auto"/>
-        <w:jc w:val="both"/>
-        <w:rPr>
-          <w:rFonts w:ascii="Times New Roman" w:hAnsi="Times New Roman" w:cs="Times New Roman"/>
-        </w:rPr>
-      </w:pPr>
-      <w:r>
-        <w:rPr>
-          <w:rFonts w:ascii="Times New Roman" w:hAnsi="Times New Roman" w:cs="Times New Roman"/>
-          <w:b/>
-          <w:bCs/>
-        </w:rPr>
-        <w:t xml:space="preserve">Derived Variables: </w:t>
-      </w:r>
-      <w:r>
-        <w:rPr>
-          <w:rFonts w:ascii="Times New Roman" w:hAnsi="Times New Roman" w:cs="Times New Roman"/>
-        </w:rPr>
-        <w:t>A MONTH variable was derived from the timestamp. In the frontend, "Severity Ratios" (e.g., arrests per $1M fines) are dynamically calculated during the D3 rendering phase based on the ARRESTS and FINES columns.</w:t>
-      </w:r>
-    </w:p>
-    <w:p>
-      <w:pPr>
-        <w:pStyle w:val="ListParagraph"/>
-        <w:numPr>
-          <w:ilvl w:val="0"/>
-          <w:numId w:val="13"/>
-        </w:numPr>
-        <w:spacing w:after="0" w:line="360" w:lineRule="auto"/>
-        <w:jc w:val="both"/>
-        <w:rPr>
-          <w:rFonts w:ascii="Times New Roman" w:hAnsi="Times New Roman" w:cs="Times New Roman"/>
-        </w:rPr>
-      </w:pPr>
-      <w:r>
-        <w:rPr>
-          <w:rFonts w:ascii="Times New Roman" w:hAnsi="Times New Roman" w:cs="Times New Roman"/>
-          <w:b/>
-          <w:bCs/>
-        </w:rPr>
-        <w:t>Data Filtering &amp; Joining:</w:t>
-      </w:r>
-      <w:r>
-        <w:rPr>
-          <w:rFonts w:ascii="Times New Roman" w:hAnsi="Times New Roman" w:cs="Times New Roman"/>
-        </w:rPr>
-        <w:t xml:space="preserve"> No rows were deleted. However, specific rows were dynamically excluded in the D3 front-end during the data-join phase to prevent mathematical double-counting (e.g., excluding All Methods or All Ages rows when specific demographics are selected by the user).</w:t>
-      </w:r>
+        <w:t xml:space="preserve">Front-end Logic: </w:t>
+      </w:r>
+      <w:r>
+        <w:rPr>
+          <w:rFonts w:ascii="Times New Roman" w:hAnsi="Times New Roman" w:cs="Times New Roman"/>
+        </w:rPr>
+        <w:t xml:space="preserve">Rows containing </w:t>
+      </w:r>
+      <w:r>
+        <w:rPr>
+          <w:rFonts w:ascii="Times New Roman" w:hAnsi="Times New Roman" w:cs="Times New Roman"/>
+        </w:rPr>
+        <w:t>“</w:t>
+      </w:r>
+      <w:r>
+        <w:rPr>
+          <w:rFonts w:ascii="Times New Roman" w:hAnsi="Times New Roman" w:cs="Times New Roman"/>
+        </w:rPr>
+        <w:t>All Methods</w:t>
+      </w:r>
+      <w:r>
+        <w:rPr>
+          <w:rFonts w:ascii="Times New Roman" w:hAnsi="Times New Roman" w:cs="Times New Roman"/>
+        </w:rPr>
+        <w:t>”</w:t>
+      </w:r>
+      <w:r>
+        <w:rPr>
+          <w:rFonts w:ascii="Times New Roman" w:hAnsi="Times New Roman" w:cs="Times New Roman"/>
+        </w:rPr>
+        <w:t xml:space="preserve"> or </w:t>
+      </w:r>
+      <w:r>
+        <w:rPr>
+          <w:rFonts w:ascii="Times New Roman" w:hAnsi="Times New Roman" w:cs="Times New Roman"/>
+        </w:rPr>
+        <w:t>“</w:t>
+      </w:r>
+      <w:r>
+        <w:rPr>
+          <w:rFonts w:ascii="Times New Roman" w:hAnsi="Times New Roman" w:cs="Times New Roman"/>
+        </w:rPr>
+        <w:t>All Ages</w:t>
+      </w:r>
+      <w:r>
+        <w:rPr>
+          <w:rFonts w:ascii="Times New Roman" w:hAnsi="Times New Roman" w:cs="Times New Roman"/>
+        </w:rPr>
+        <w:t>”</w:t>
+      </w:r>
+      <w:r>
+        <w:rPr>
+          <w:rFonts w:ascii="Times New Roman" w:hAnsi="Times New Roman" w:cs="Times New Roman"/>
+        </w:rPr>
+        <w:t xml:space="preserve"> are dynamically excluded during the D3 data-join phase (not deleted from CSV) to prevent mathematical double-counting when users filter for specific demographics.</w:t>
+      </w:r>
+    </w:p>
+    <w:p>
+      <w:pPr>
+        <w:spacing w:after="0" w:line="360" w:lineRule="auto"/>
+        <w:jc w:val="both"/>
+        <w:rPr>
+          <w:rFonts w:ascii="Times New Roman" w:hAnsi="Times New Roman" w:cs="Times New Roman"/>
+        </w:rPr>
+      </w:pPr>
+    </w:p>
+    <w:p>
+      <w:pPr>
+        <w:spacing w:after="0" w:line="360" w:lineRule="auto"/>
+        <w:jc w:val="both"/>
+        <w:rPr>
+          <w:rFonts w:ascii="Times New Roman" w:hAnsi="Times New Roman" w:cs="Times New Roman"/>
+        </w:rPr>
+      </w:pPr>
+    </w:p>
+    <w:p>
+      <w:pPr>
+        <w:spacing w:after="0" w:line="360" w:lineRule="auto"/>
+        <w:jc w:val="both"/>
+        <w:rPr>
+          <w:rFonts w:ascii="Times New Roman" w:hAnsi="Times New Roman" w:cs="Times New Roman"/>
+        </w:rPr>
+      </w:pPr>
+    </w:p>
+    <w:p>
+      <w:pPr>
+        <w:spacing w:after="0" w:line="360" w:lineRule="auto"/>
+        <w:jc w:val="both"/>
+        <w:rPr>
+          <w:rFonts w:ascii="Times New Roman" w:hAnsi="Times New Roman" w:cs="Times New Roman"/>
+        </w:rPr>
+      </w:pPr>
+    </w:p>
+    <w:p>
+      <w:pPr>
+        <w:spacing w:after="0" w:line="360" w:lineRule="auto"/>
+        <w:jc w:val="both"/>
+        <w:rPr>
+          <w:rFonts w:ascii="Times New Roman" w:hAnsi="Times New Roman" w:cs="Times New Roman"/>
+        </w:rPr>
+      </w:pPr>
+    </w:p>
+    <w:p>
+      <w:pPr>
+        <w:spacing w:after="0" w:line="360" w:lineRule="auto"/>
+        <w:jc w:val="both"/>
+        <w:rPr>
+          <w:rFonts w:ascii="Times New Roman" w:hAnsi="Times New Roman" w:cs="Times New Roman"/>
+        </w:rPr>
+      </w:pPr>
+    </w:p>
+    <w:p>
+      <w:pPr>
+        <w:spacing w:after="0" w:line="360" w:lineRule="auto"/>
+        <w:jc w:val="both"/>
+        <w:rPr>
+          <w:rFonts w:ascii="Times New Roman" w:hAnsi="Times New Roman" w:cs="Times New Roman"/>
+        </w:rPr>
+      </w:pPr>
+    </w:p>
+    <w:p>
+      <w:pPr>
+        <w:spacing w:after="0" w:line="360" w:lineRule="auto"/>
+        <w:jc w:val="both"/>
+        <w:rPr>
+          <w:rFonts w:ascii="Times New Roman" w:hAnsi="Times New Roman" w:cs="Times New Roman"/>
+        </w:rPr>
+      </w:pPr>
+    </w:p>
+    <w:p>
+      <w:pPr>
+        <w:spacing w:after="0" w:line="360" w:lineRule="auto"/>
+        <w:jc w:val="both"/>
+        <w:rPr>
+          <w:rFonts w:ascii="Times New Roman" w:hAnsi="Times New Roman" w:cs="Times New Roman"/>
+        </w:rPr>
+      </w:pPr>
+    </w:p>
+    <w:p>
+      <w:pPr>
+        <w:spacing w:after="0" w:line="360" w:lineRule="auto"/>
+        <w:jc w:val="both"/>
+        <w:rPr>
+          <w:rFonts w:ascii="Times New Roman" w:hAnsi="Times New Roman" w:cs="Times New Roman"/>
+        </w:rPr>
+      </w:pPr>
+    </w:p>
+    <w:p>
+      <w:pPr>
+        <w:spacing w:after="0" w:line="360" w:lineRule="auto"/>
+        <w:jc w:val="both"/>
+        <w:rPr>
+          <w:rFonts w:ascii="Times New Roman" w:hAnsi="Times New Roman" w:cs="Times New Roman"/>
+        </w:rPr>
+      </w:pPr>
+    </w:p>
+    <w:p>
+      <w:pPr>
+        <w:spacing w:after="0" w:line="360" w:lineRule="auto"/>
+        <w:jc w:val="both"/>
+        <w:rPr>
+          <w:rFonts w:ascii="Times New Roman" w:hAnsi="Times New Roman" w:cs="Times New Roman"/>
+        </w:rPr>
+      </w:pPr>
     </w:p>
     <w:p>
       <w:pPr>
@@ -4283,6 +4332,7 @@
           <w:rFonts w:ascii="Times New Roman" w:hAnsi="Times New Roman" w:cs="Times New Roman"/>
           <w:b/>
           <w:bCs/>
+          <w:noProof/>
         </w:rPr>
         <w:drawing>
           <wp:inline distT="0" distB="0" distL="0" distR="0" wp14:anchorId="761F3D76" wp14:editId="5831E884">
@@ -4566,7 +4616,21 @@
         <w:rPr>
           <w:rFonts w:ascii="Times New Roman" w:hAnsi="Times New Roman" w:cs="Times New Roman"/>
         </w:rPr>
-        <w:t xml:space="preserve"> The Sorter prepares the clean data for branching into 4 distinct GroupBy nodes. Each branch generates a specific CSV tailored for a D3.js component:</w:t>
+        <w:t xml:space="preserve"> The Sorter prepares the clean data for branching into 4 distinct </w:t>
+      </w:r>
+      <w:proofErr w:type="spellStart"/>
+      <w:r>
+        <w:rPr>
+          <w:rFonts w:ascii="Times New Roman" w:hAnsi="Times New Roman" w:cs="Times New Roman"/>
+        </w:rPr>
+        <w:t>GroupBy</w:t>
+      </w:r>
+      <w:proofErr w:type="spellEnd"/>
+      <w:r>
+        <w:rPr>
+          <w:rFonts w:ascii="Times New Roman" w:hAnsi="Times New Roman" w:cs="Times New Roman"/>
+        </w:rPr>
+        <w:t xml:space="preserve"> nodes. Each branch generates a specific CSV tailored for a D3.js component:</w:t>
       </w:r>
     </w:p>
     <w:p>
@@ -4752,10 +4816,7 @@
         <w:t>2.</w:t>
       </w:r>
       <w:r>
-        <w:t>3</w:t>
-      </w:r>
-      <w:r>
-        <w:t xml:space="preserve"> </w:t>
+        <w:t xml:space="preserve">3 </w:t>
       </w:r>
       <w:r>
         <w:t>Data</w:t>
@@ -4854,7 +4915,49 @@
         <w:rPr>
           <w:rFonts w:ascii="Times New Roman" w:hAnsi="Times New Roman" w:cs="Times New Roman"/>
         </w:rPr>
-        <w:t xml:space="preserve"> The dataset revealed a severe skew in speed_fines, with FINES reaching into the tens of millions, completely dwarfing other metrics like mobile_phone_use and non_wearing_seatbelts.</w:t>
+        <w:t xml:space="preserve"> The dataset revealed a severe skew in </w:t>
+      </w:r>
+      <w:proofErr w:type="spellStart"/>
+      <w:r>
+        <w:rPr>
+          <w:rFonts w:ascii="Times New Roman" w:hAnsi="Times New Roman" w:cs="Times New Roman"/>
+        </w:rPr>
+        <w:t>speed_fines</w:t>
+      </w:r>
+      <w:proofErr w:type="spellEnd"/>
+      <w:r>
+        <w:rPr>
+          <w:rFonts w:ascii="Times New Roman" w:hAnsi="Times New Roman" w:cs="Times New Roman"/>
+        </w:rPr>
+        <w:t xml:space="preserve">, with FINES reaching into the tens of millions, completely dwarfing other metrics like </w:t>
+      </w:r>
+      <w:proofErr w:type="spellStart"/>
+      <w:r>
+        <w:rPr>
+          <w:rFonts w:ascii="Times New Roman" w:hAnsi="Times New Roman" w:cs="Times New Roman"/>
+        </w:rPr>
+        <w:t>mobile_phone_use</w:t>
+      </w:r>
+      <w:proofErr w:type="spellEnd"/>
+      <w:r>
+        <w:rPr>
+          <w:rFonts w:ascii="Times New Roman" w:hAnsi="Times New Roman" w:cs="Times New Roman"/>
+        </w:rPr>
+        <w:t xml:space="preserve"> and </w:t>
+      </w:r>
+      <w:proofErr w:type="spellStart"/>
+      <w:r>
+        <w:rPr>
+          <w:rFonts w:ascii="Times New Roman" w:hAnsi="Times New Roman" w:cs="Times New Roman"/>
+        </w:rPr>
+        <w:t>non_wearing_seatbelts</w:t>
+      </w:r>
+      <w:proofErr w:type="spellEnd"/>
+      <w:r>
+        <w:rPr>
+          <w:rFonts w:ascii="Times New Roman" w:hAnsi="Times New Roman" w:cs="Times New Roman"/>
+        </w:rPr>
+        <w:t>.</w:t>
       </w:r>
     </w:p>
     <w:p>
@@ -4938,7 +5041,21 @@
         <w:rPr>
           <w:rFonts w:ascii="Times New Roman" w:hAnsi="Times New Roman" w:cs="Times New Roman"/>
         </w:rPr>
-        <w:t xml:space="preserve"> (e.g., row 100 in fine_grained_intersection.csv) represent massive aggregate numbers (e.g., 49,339,892 speed fines for 26-39 year olds). These were treated as aggregate metadata rather than specific demographic data in the front-end logic to prevent visual distortion.</w:t>
+        <w:t xml:space="preserve"> (e.g., row 100 in fine_grained_intersection.csv) represent massive aggregate numbers (e.g., 49,339,892 speed fines for </w:t>
+      </w:r>
+      <w:proofErr w:type="gramStart"/>
+      <w:r>
+        <w:rPr>
+          <w:rFonts w:ascii="Times New Roman" w:hAnsi="Times New Roman" w:cs="Times New Roman"/>
+        </w:rPr>
+        <w:t>26-39 year olds</w:t>
+      </w:r>
+      <w:proofErr w:type="gramEnd"/>
+      <w:r>
+        <w:rPr>
+          <w:rFonts w:ascii="Times New Roman" w:hAnsi="Times New Roman" w:cs="Times New Roman"/>
+        </w:rPr>
+        <w:t>). These were treated as aggregate metadata rather than specific demographic data in the front-end logic to prevent visual distortion.</w:t>
       </w:r>
     </w:p>
     <w:p>
@@ -5051,6 +5168,17 @@
           <w:bCs/>
         </w:rPr>
       </w:pPr>
+    </w:p>
+    <w:p>
+      <w:pPr>
+        <w:spacing w:after="0" w:line="360" w:lineRule="auto"/>
+        <w:jc w:val="both"/>
+        <w:rPr>
+          <w:rFonts w:ascii="Times New Roman" w:hAnsi="Times New Roman" w:cs="Times New Roman"/>
+          <w:b/>
+          <w:bCs/>
+        </w:rPr>
+      </w:pPr>
       <w:r>
         <w:rPr>
           <w:rFonts w:ascii="Times New Roman" w:hAnsi="Times New Roman" w:cs="Times New Roman"/>
@@ -5096,31 +5224,7 @@
         <w:rPr>
           <w:rFonts w:ascii="Times New Roman" w:hAnsi="Times New Roman" w:cs="Times New Roman"/>
         </w:rPr>
-        <w:t xml:space="preserve"> The camera systems produce many tickets, but don’t produce any arrests or charges from those tickets. In contrast, police officers produce far fewer tickets than automated camera systems but produce </w:t>
-      </w:r>
-      <w:r>
-        <w:rPr>
-          <w:rFonts w:ascii="Times New Roman" w:hAnsi="Times New Roman" w:cs="Times New Roman"/>
-        </w:rPr>
-        <w:t>most of</w:t>
-      </w:r>
-      <w:r>
-        <w:rPr>
-          <w:rFonts w:ascii="Times New Roman" w:hAnsi="Times New Roman" w:cs="Times New Roman"/>
-        </w:rPr>
-        <w:t xml:space="preserve"> the arrests; therefore, a simple side-by-side comparison between the two types of enforcement would not provide an accurate measurement of either method's true effectiveness as a means </w:t>
-      </w:r>
-      <w:r>
-        <w:rPr>
-          <w:rFonts w:ascii="Times New Roman" w:hAnsi="Times New Roman" w:cs="Times New Roman"/>
-        </w:rPr>
-        <w:t>of “Enforcement</w:t>
-      </w:r>
-      <w:r>
-        <w:rPr>
-          <w:rFonts w:ascii="Times New Roman" w:hAnsi="Times New Roman" w:cs="Times New Roman"/>
-        </w:rPr>
-        <w:t xml:space="preserve"> Severity</w:t>
+        <w:t xml:space="preserve"> The camera systems produce many tickets, but don’t produce any arrests or charges from those tickets. In contrast, police officers produce far fewer tickets than automated camera systems but produce most of the arrests; therefore, a simple side-by-side comparison between the two types of enforcement would not provide an accurate measurement of either method's true effectiveness as a means of “Enforcement Severity</w:t>
       </w:r>
       <w:r>
         <w:rPr>
@@ -5132,19 +5236,7 @@
         <w:rPr>
           <w:rFonts w:ascii="Times New Roman" w:hAnsi="Times New Roman" w:cs="Times New Roman"/>
         </w:rPr>
-        <w:t xml:space="preserve">. </w:t>
-      </w:r>
-      <w:r>
-        <w:rPr>
-          <w:rFonts w:ascii="Times New Roman" w:hAnsi="Times New Roman" w:cs="Times New Roman"/>
-        </w:rPr>
-        <w:t>To</w:t>
-      </w:r>
-      <w:r>
-        <w:rPr>
-          <w:rFonts w:ascii="Times New Roman" w:hAnsi="Times New Roman" w:cs="Times New Roman"/>
-        </w:rPr>
-        <w:t xml:space="preserve"> be able to make a valid comparison, we developed a </w:t>
+        <w:t xml:space="preserve">. To be able to make a valid comparison, we developed a </w:t>
       </w:r>
       <w:r>
         <w:rPr>
@@ -5168,19 +5260,7 @@
         <w:rPr>
           <w:rFonts w:ascii="Times New Roman" w:hAnsi="Times New Roman" w:cs="Times New Roman"/>
         </w:rPr>
-        <w:t xml:space="preserve"> using vbar.js that provides separate scales for both fines and arrests, so that users can visually </w:t>
-      </w:r>
-      <w:r>
-        <w:rPr>
-          <w:rFonts w:ascii="Times New Roman" w:hAnsi="Times New Roman" w:cs="Times New Roman"/>
-        </w:rPr>
-        <w:t>analyse</w:t>
-      </w:r>
-      <w:r>
-        <w:rPr>
-          <w:rFonts w:ascii="Times New Roman" w:hAnsi="Times New Roman" w:cs="Times New Roman"/>
-        </w:rPr>
-        <w:t xml:space="preserve"> the actual relative </w:t>
+        <w:t xml:space="preserve"> using vbar.js that provides separate scales for both fines and arrests, so that users can visually analyse the actual relative </w:t>
       </w:r>
       <w:r>
         <w:rPr>
@@ -5207,10 +5287,445 @@
         <w:t xml:space="preserve"> in each jurisdiction without distortion due to scale.</w:t>
       </w:r>
     </w:p>
+    <w:p>
+      <w:pPr>
+        <w:spacing w:after="0" w:line="360" w:lineRule="auto"/>
+        <w:jc w:val="both"/>
+        <w:rPr>
+          <w:rFonts w:ascii="Times New Roman" w:hAnsi="Times New Roman" w:cs="Times New Roman"/>
+        </w:rPr>
+      </w:pPr>
+    </w:p>
+    <w:p>
+      <w:pPr>
+        <w:spacing w:after="0" w:line="360" w:lineRule="auto"/>
+        <w:jc w:val="both"/>
+        <w:rPr>
+          <w:rFonts w:ascii="Times New Roman" w:hAnsi="Times New Roman" w:cs="Times New Roman"/>
+        </w:rPr>
+      </w:pPr>
+    </w:p>
+    <w:p>
+      <w:pPr>
+        <w:spacing w:after="0" w:line="360" w:lineRule="auto"/>
+        <w:jc w:val="both"/>
+        <w:rPr>
+          <w:rFonts w:ascii="Times New Roman" w:hAnsi="Times New Roman" w:cs="Times New Roman"/>
+        </w:rPr>
+      </w:pPr>
+    </w:p>
+    <w:p>
+      <w:pPr>
+        <w:spacing w:after="0" w:line="360" w:lineRule="auto"/>
+        <w:jc w:val="both"/>
+        <w:rPr>
+          <w:rFonts w:ascii="Times New Roman" w:hAnsi="Times New Roman" w:cs="Times New Roman"/>
+        </w:rPr>
+      </w:pPr>
+    </w:p>
+    <w:p>
+      <w:pPr>
+        <w:pStyle w:val="Heading1"/>
+      </w:pPr>
+      <w:r>
+        <w:rPr>
+          <w:rFonts w:hint="eastAsia"/>
+        </w:rPr>
+        <w:lastRenderedPageBreak/>
+        <w:t>3</w:t>
+      </w:r>
+      <w:r>
+        <w:t xml:space="preserve">.0 </w:t>
+      </w:r>
+      <w:r>
+        <w:t>Visualisation Design</w:t>
+      </w:r>
+    </w:p>
+    <w:p>
+      <w:pPr>
+        <w:pStyle w:val="Heading2"/>
+      </w:pPr>
+      <w:r>
+        <w:rPr>
+          <w:rFonts w:hint="eastAsia"/>
+        </w:rPr>
+        <w:t>3</w:t>
+      </w:r>
+      <w:r>
+        <w:t xml:space="preserve">.1 </w:t>
+      </w:r>
+      <w:r>
+        <w:t>Website Design</w:t>
+      </w:r>
+    </w:p>
+    <w:p>
+      <w:pPr>
+        <w:spacing w:after="0" w:line="360" w:lineRule="auto"/>
+        <w:jc w:val="both"/>
+        <w:rPr>
+          <w:rFonts w:ascii="Times New Roman" w:hAnsi="Times New Roman" w:cs="Times New Roman"/>
+        </w:rPr>
+      </w:pPr>
+      <w:r>
+        <w:rPr>
+          <w:noProof/>
+        </w:rPr>
+        <w:drawing>
+          <wp:inline distT="0" distB="0" distL="0" distR="0" wp14:anchorId="073DC8FF" wp14:editId="53549473">
+            <wp:extent cx="5731510" cy="2977515"/>
+            <wp:effectExtent l="0" t="0" r="2540" b="0"/>
+            <wp:docPr id="88212519" name="Picture 1"/>
+            <wp:cNvGraphicFramePr>
+              <a:graphicFrameLocks xmlns:a="http://schemas.openxmlformats.org/drawingml/2006/main" noChangeAspect="1"/>
+            </wp:cNvGraphicFramePr>
+            <a:graphic xmlns:a="http://schemas.openxmlformats.org/drawingml/2006/main">
+              <a:graphicData uri="http://schemas.openxmlformats.org/drawingml/2006/picture">
+                <pic:pic xmlns:pic="http://schemas.openxmlformats.org/drawingml/2006/picture">
+                  <pic:nvPicPr>
+                    <pic:cNvPr id="0" name="Picture 1"/>
+                    <pic:cNvPicPr>
+                      <a:picLocks noChangeAspect="1" noChangeArrowheads="1"/>
+                    </pic:cNvPicPr>
+                  </pic:nvPicPr>
+                  <pic:blipFill>
+                    <a:blip r:embed="rId12" cstate="print">
+                      <a:extLst>
+                        <a:ext uri="{28A0092B-C50C-407E-A947-70E740481C1C}">
+                          <a14:useLocalDpi xmlns:a14="http://schemas.microsoft.com/office/drawing/2010/main" val="0"/>
+                        </a:ext>
+                      </a:extLst>
+                    </a:blip>
+                    <a:srcRect/>
+                    <a:stretch>
+                      <a:fillRect/>
+                    </a:stretch>
+                  </pic:blipFill>
+                  <pic:spPr bwMode="auto">
+                    <a:xfrm>
+                      <a:off x="0" y="0"/>
+                      <a:ext cx="5731510" cy="2977515"/>
+                    </a:xfrm>
+                    <a:prstGeom prst="rect">
+                      <a:avLst/>
+                    </a:prstGeom>
+                    <a:noFill/>
+                    <a:ln>
+                      <a:noFill/>
+                    </a:ln>
+                  </pic:spPr>
+                </pic:pic>
+              </a:graphicData>
+            </a:graphic>
+          </wp:inline>
+        </w:drawing>
+      </w:r>
+    </w:p>
+    <w:p>
+      <w:pPr>
+        <w:spacing w:after="0" w:line="360" w:lineRule="auto"/>
+        <w:jc w:val="center"/>
+        <w:rPr>
+          <w:rFonts w:ascii="Times New Roman" w:hAnsi="Times New Roman" w:cs="Times New Roman"/>
+          <w:b/>
+          <w:bCs/>
+        </w:rPr>
+      </w:pPr>
+      <w:r>
+        <w:rPr>
+          <w:rFonts w:ascii="Times New Roman" w:hAnsi="Times New Roman" w:cs="Times New Roman"/>
+          <w:b/>
+          <w:bCs/>
+        </w:rPr>
+        <w:t>Figure 2:</w:t>
+      </w:r>
+      <w:r>
+        <w:rPr>
+          <w:b/>
+          <w:bCs/>
+        </w:rPr>
+        <w:t xml:space="preserve"> </w:t>
+      </w:r>
+      <w:r>
+        <w:rPr>
+          <w:rFonts w:ascii="Times New Roman" w:hAnsi="Times New Roman" w:cs="Times New Roman"/>
+          <w:b/>
+          <w:bCs/>
+        </w:rPr>
+        <w:t>the overview with KPIs and Area chart</w:t>
+      </w:r>
+    </w:p>
+    <w:p>
+      <w:pPr>
+        <w:spacing w:after="0" w:line="360" w:lineRule="auto"/>
+        <w:jc w:val="both"/>
+        <w:rPr>
+          <w:rFonts w:ascii="Times New Roman" w:hAnsi="Times New Roman" w:cs="Times New Roman"/>
+          <w:b/>
+          <w:bCs/>
+        </w:rPr>
+      </w:pPr>
+    </w:p>
+    <w:p>
+      <w:pPr>
+        <w:spacing w:after="0" w:line="360" w:lineRule="auto"/>
+        <w:jc w:val="both"/>
+        <w:rPr>
+          <w:rFonts w:ascii="Times New Roman" w:hAnsi="Times New Roman" w:cs="Times New Roman"/>
+          <w:b/>
+          <w:bCs/>
+        </w:rPr>
+      </w:pPr>
+    </w:p>
+    <w:p>
+      <w:pPr>
+        <w:spacing w:after="0" w:line="360" w:lineRule="auto"/>
+        <w:jc w:val="both"/>
+        <w:rPr>
+          <w:rFonts w:ascii="Times New Roman" w:hAnsi="Times New Roman" w:cs="Times New Roman"/>
+          <w:b/>
+          <w:bCs/>
+        </w:rPr>
+      </w:pPr>
+      <w:r>
+        <w:rPr>
+          <w:rFonts w:ascii="Times New Roman" w:hAnsi="Times New Roman" w:cs="Times New Roman"/>
+          <w:b/>
+          <w:bCs/>
+        </w:rPr>
+        <w:t>Wireframe Rationale:</w:t>
+      </w:r>
+    </w:p>
+    <w:p>
+      <w:pPr>
+        <w:spacing w:after="0" w:line="360" w:lineRule="auto"/>
+        <w:jc w:val="both"/>
+        <w:rPr>
+          <w:rFonts w:ascii="Times New Roman" w:hAnsi="Times New Roman" w:cs="Times New Roman"/>
+        </w:rPr>
+      </w:pPr>
+      <w:r>
+        <w:rPr>
+          <w:rFonts w:ascii="Times New Roman" w:hAnsi="Times New Roman" w:cs="Times New Roman"/>
+        </w:rPr>
+        <w:t xml:space="preserve">As shown in Figure 2, the webpage employs a left-rail navigation layout combined with a top-down visual hierarchy, adhering to </w:t>
+      </w:r>
+      <w:r>
+        <w:rPr>
+          <w:rFonts w:ascii="Times New Roman" w:hAnsi="Times New Roman" w:cs="Times New Roman"/>
+          <w:b/>
+          <w:bCs/>
+        </w:rPr>
+        <w:t>Munzner’s</w:t>
+      </w:r>
+      <w:r>
+        <w:rPr>
+          <w:rFonts w:ascii="Times New Roman" w:hAnsi="Times New Roman" w:cs="Times New Roman"/>
+        </w:rPr>
+        <w:t xml:space="preserve"> nested model for data exploration.</w:t>
+      </w:r>
+    </w:p>
+    <w:p>
+      <w:pPr>
+        <w:pStyle w:val="ListParagraph"/>
+        <w:numPr>
+          <w:ilvl w:val="0"/>
+          <w:numId w:val="18"/>
+        </w:numPr>
+        <w:spacing w:after="0" w:line="360" w:lineRule="auto"/>
+        <w:jc w:val="both"/>
+        <w:rPr>
+          <w:rFonts w:ascii="Times New Roman" w:hAnsi="Times New Roman" w:cs="Times New Roman"/>
+        </w:rPr>
+      </w:pPr>
+      <w:r>
+        <w:rPr>
+          <w:rFonts w:ascii="Times New Roman" w:hAnsi="Times New Roman" w:cs="Times New Roman"/>
+          <w:b/>
+          <w:bCs/>
+        </w:rPr>
+        <w:t>Level 1 (Macro Overview):</w:t>
+      </w:r>
+      <w:r>
+        <w:rPr>
+          <w:rFonts w:ascii="Times New Roman" w:hAnsi="Times New Roman" w:cs="Times New Roman"/>
+        </w:rPr>
+        <w:t xml:space="preserve"> The top section features three distinct KPI cards (Total Fines $63.5M, Total Arrests 9,184, Total Charges 122,732). This provides an immediate </w:t>
+      </w:r>
+      <w:r>
+        <w:rPr>
+          <w:rFonts w:ascii="Times New Roman" w:hAnsi="Times New Roman" w:cs="Times New Roman"/>
+        </w:rPr>
+        <w:t>“</w:t>
+      </w:r>
+      <w:r>
+        <w:rPr>
+          <w:rFonts w:ascii="Times New Roman" w:hAnsi="Times New Roman" w:cs="Times New Roman"/>
+        </w:rPr>
+        <w:t>Overview first</w:t>
+      </w:r>
+      <w:r>
+        <w:rPr>
+          <w:rFonts w:ascii="Times New Roman" w:hAnsi="Times New Roman" w:cs="Times New Roman"/>
+        </w:rPr>
+        <w:t>”</w:t>
+      </w:r>
+      <w:r>
+        <w:rPr>
+          <w:rFonts w:ascii="Times New Roman" w:hAnsi="Times New Roman" w:cs="Times New Roman"/>
+        </w:rPr>
+        <w:t xml:space="preserve"> anchor, allowing policymakers to instantly grasp the stark volume disparity between financial penalties and criminal actions.</w:t>
+      </w:r>
+    </w:p>
+    <w:p>
+      <w:pPr>
+        <w:pStyle w:val="ListParagraph"/>
+        <w:numPr>
+          <w:ilvl w:val="0"/>
+          <w:numId w:val="18"/>
+        </w:numPr>
+        <w:spacing w:after="0" w:line="360" w:lineRule="auto"/>
+        <w:jc w:val="both"/>
+        <w:rPr>
+          <w:rFonts w:ascii="Times New Roman" w:hAnsi="Times New Roman" w:cs="Times New Roman"/>
+        </w:rPr>
+      </w:pPr>
+      <w:r>
+        <w:rPr>
+          <w:rFonts w:ascii="Times New Roman" w:hAnsi="Times New Roman" w:cs="Times New Roman"/>
+          <w:b/>
+          <w:bCs/>
+        </w:rPr>
+        <w:t>Level 2 (Temporal Context):</w:t>
+      </w:r>
+      <w:r>
+        <w:rPr>
+          <w:rFonts w:ascii="Times New Roman" w:hAnsi="Times New Roman" w:cs="Times New Roman"/>
+        </w:rPr>
+        <w:t xml:space="preserve"> Directly below the KPIs sits the </w:t>
+      </w:r>
+      <w:r>
+        <w:rPr>
+          <w:rFonts w:ascii="Times New Roman" w:hAnsi="Times New Roman" w:cs="Times New Roman"/>
+        </w:rPr>
+        <w:t>“</w:t>
+      </w:r>
+      <w:r>
+        <w:rPr>
+          <w:rFonts w:ascii="Times New Roman" w:hAnsi="Times New Roman" w:cs="Times New Roman"/>
+        </w:rPr>
+        <w:t>Monthly Fines Trend</w:t>
+      </w:r>
+      <w:r>
+        <w:rPr>
+          <w:rFonts w:ascii="Times New Roman" w:hAnsi="Times New Roman" w:cs="Times New Roman"/>
+        </w:rPr>
+        <w:t>”</w:t>
+      </w:r>
+      <w:r>
+        <w:rPr>
+          <w:rFonts w:ascii="Times New Roman" w:hAnsi="Times New Roman" w:cs="Times New Roman"/>
+        </w:rPr>
+        <w:t xml:space="preserve"> area chart (2008-2024). This positions historical longitudinal trends as the secondary focal point, answering Task 4 before the user even scrolls.</w:t>
+      </w:r>
+    </w:p>
+    <w:p>
+      <w:pPr>
+        <w:pStyle w:val="ListParagraph"/>
+        <w:numPr>
+          <w:ilvl w:val="0"/>
+          <w:numId w:val="18"/>
+        </w:numPr>
+        <w:spacing w:after="0" w:line="360" w:lineRule="auto"/>
+        <w:jc w:val="both"/>
+        <w:rPr>
+          <w:rFonts w:ascii="Times New Roman" w:hAnsi="Times New Roman" w:cs="Times New Roman"/>
+        </w:rPr>
+      </w:pPr>
+      <w:r>
+        <w:rPr>
+          <w:rFonts w:ascii="Times New Roman" w:hAnsi="Times New Roman" w:cs="Times New Roman"/>
+          <w:b/>
+          <w:bCs/>
+        </w:rPr>
+        <w:t>Level 3 (Micro Breakdown):</w:t>
+      </w:r>
+      <w:r>
+        <w:rPr>
+          <w:rFonts w:ascii="Times New Roman" w:hAnsi="Times New Roman" w:cs="Times New Roman"/>
+        </w:rPr>
+        <w:t xml:space="preserve"> The lower fold reserves space for demographic and metric-specific breakdowns (</w:t>
+      </w:r>
+      <w:r>
+        <w:rPr>
+          <w:rFonts w:ascii="Times New Roman" w:hAnsi="Times New Roman" w:cs="Times New Roman"/>
+        </w:rPr>
+        <w:t>“</w:t>
+      </w:r>
+      <w:r>
+        <w:rPr>
+          <w:rFonts w:ascii="Times New Roman" w:hAnsi="Times New Roman" w:cs="Times New Roman"/>
+        </w:rPr>
+        <w:t>Fines vs Arrests by Age</w:t>
+      </w:r>
+      <w:r>
+        <w:rPr>
+          <w:rFonts w:ascii="Times New Roman" w:hAnsi="Times New Roman" w:cs="Times New Roman"/>
+        </w:rPr>
+        <w:t>”</w:t>
+      </w:r>
+      <w:r>
+        <w:rPr>
+          <w:rFonts w:ascii="Times New Roman" w:hAnsi="Times New Roman" w:cs="Times New Roman"/>
+        </w:rPr>
+        <w:t xml:space="preserve">, </w:t>
+      </w:r>
+      <w:r>
+        <w:rPr>
+          <w:rFonts w:ascii="Times New Roman" w:hAnsi="Times New Roman" w:cs="Times New Roman"/>
+        </w:rPr>
+        <w:t>“</w:t>
+      </w:r>
+      <w:r>
+        <w:rPr>
+          <w:rFonts w:ascii="Times New Roman" w:hAnsi="Times New Roman" w:cs="Times New Roman"/>
+        </w:rPr>
+        <w:t>Metric Distribution</w:t>
+      </w:r>
+      <w:r>
+        <w:rPr>
+          <w:rFonts w:ascii="Times New Roman" w:hAnsi="Times New Roman" w:cs="Times New Roman"/>
+        </w:rPr>
+        <w:t>”</w:t>
+      </w:r>
+      <w:r>
+        <w:rPr>
+          <w:rFonts w:ascii="Times New Roman" w:hAnsi="Times New Roman" w:cs="Times New Roman"/>
+        </w:rPr>
+        <w:t>). This structured flow prevents cognitive overload, ensuring users understand the macro severity before investigating demographic nuances.</w:t>
+      </w:r>
+    </w:p>
+    <w:p>
+      <w:pPr>
+        <w:spacing w:after="0" w:line="360" w:lineRule="auto"/>
+        <w:jc w:val="both"/>
+        <w:rPr>
+          <w:rFonts w:ascii="Times New Roman" w:hAnsi="Times New Roman" w:cs="Times New Roman"/>
+        </w:rPr>
+      </w:pPr>
+    </w:p>
+    <w:p>
+      <w:pPr>
+        <w:spacing w:after="0" w:line="360" w:lineRule="auto"/>
+        <w:jc w:val="both"/>
+        <w:rPr>
+          <w:rFonts w:ascii="Times New Roman" w:hAnsi="Times New Roman" w:cs="Times New Roman"/>
+        </w:rPr>
+      </w:pPr>
+    </w:p>
     <w:sectPr>
-      <w:headerReference w:type="default" r:id="rId12"/>
-      <w:footerReference w:type="even" r:id="rId13"/>
-      <w:footerReference w:type="default" r:id="rId14"/>
+      <w:headerReference w:type="default" r:id="rId13"/>
+      <w:footerReference w:type="even" r:id="rId14"/>
+      <w:footerReference w:type="default" r:id="rId15"/>
       <w:pgSz w:w="11906" w:h="16838"/>
       <w:pgMar w:top="1440" w:right="1440" w:bottom="1440" w:left="1440" w:header="708" w:footer="708" w:gutter="0"/>
       <w:pgNumType w:start="0"/>
@@ -6421,6 +6936,119 @@
     </w:lvl>
   </w:abstractNum>
   <w:abstractNum w:abstractNumId="9" w15:restartNumberingAfterBreak="0">
+    <w:nsid w:val="57094DB5"/>
+    <w:multiLevelType w:val="hybridMultilevel"/>
+    <w:tmpl w:val="BC1881B4"/>
+    <w:lvl w:ilvl="0" w:tplc="44090001">
+      <w:start w:val="1"/>
+      <w:numFmt w:val="bullet"/>
+      <w:lvlText w:val=""/>
+      <w:lvlJc w:val="left"/>
+      <w:pPr>
+        <w:ind w:left="360" w:hanging="360"/>
+      </w:pPr>
+      <w:rPr>
+        <w:rFonts w:ascii="Symbol" w:hAnsi="Symbol" w:hint="default"/>
+      </w:rPr>
+    </w:lvl>
+    <w:lvl w:ilvl="1" w:tplc="44090003" w:tentative="1">
+      <w:start w:val="1"/>
+      <w:numFmt w:val="bullet"/>
+      <w:lvlText w:val="o"/>
+      <w:lvlJc w:val="left"/>
+      <w:pPr>
+        <w:ind w:left="1080" w:hanging="360"/>
+      </w:pPr>
+      <w:rPr>
+        <w:rFonts w:ascii="Courier New" w:hAnsi="Courier New" w:cs="Courier New" w:hint="default"/>
+      </w:rPr>
+    </w:lvl>
+    <w:lvl w:ilvl="2" w:tplc="44090005" w:tentative="1">
+      <w:start w:val="1"/>
+      <w:numFmt w:val="bullet"/>
+      <w:lvlText w:val=""/>
+      <w:lvlJc w:val="left"/>
+      <w:pPr>
+        <w:ind w:left="1800" w:hanging="360"/>
+      </w:pPr>
+      <w:rPr>
+        <w:rFonts w:ascii="Wingdings" w:hAnsi="Wingdings" w:hint="default"/>
+      </w:rPr>
+    </w:lvl>
+    <w:lvl w:ilvl="3" w:tplc="44090001" w:tentative="1">
+      <w:start w:val="1"/>
+      <w:numFmt w:val="bullet"/>
+      <w:lvlText w:val=""/>
+      <w:lvlJc w:val="left"/>
+      <w:pPr>
+        <w:ind w:left="2520" w:hanging="360"/>
+      </w:pPr>
+      <w:rPr>
+        <w:rFonts w:ascii="Symbol" w:hAnsi="Symbol" w:hint="default"/>
+      </w:rPr>
+    </w:lvl>
+    <w:lvl w:ilvl="4" w:tplc="44090003" w:tentative="1">
+      <w:start w:val="1"/>
+      <w:numFmt w:val="bullet"/>
+      <w:lvlText w:val="o"/>
+      <w:lvlJc w:val="left"/>
+      <w:pPr>
+        <w:ind w:left="3240" w:hanging="360"/>
+      </w:pPr>
+      <w:rPr>
+        <w:rFonts w:ascii="Courier New" w:hAnsi="Courier New" w:cs="Courier New" w:hint="default"/>
+      </w:rPr>
+    </w:lvl>
+    <w:lvl w:ilvl="5" w:tplc="44090005" w:tentative="1">
+      <w:start w:val="1"/>
+      <w:numFmt w:val="bullet"/>
+      <w:lvlText w:val=""/>
+      <w:lvlJc w:val="left"/>
+      <w:pPr>
+        <w:ind w:left="3960" w:hanging="360"/>
+      </w:pPr>
+      <w:rPr>
+        <w:rFonts w:ascii="Wingdings" w:hAnsi="Wingdings" w:hint="default"/>
+      </w:rPr>
+    </w:lvl>
+    <w:lvl w:ilvl="6" w:tplc="44090001" w:tentative="1">
+      <w:start w:val="1"/>
+      <w:numFmt w:val="bullet"/>
+      <w:lvlText w:val=""/>
+      <w:lvlJc w:val="left"/>
+      <w:pPr>
+        <w:ind w:left="4680" w:hanging="360"/>
+      </w:pPr>
+      <w:rPr>
+        <w:rFonts w:ascii="Symbol" w:hAnsi="Symbol" w:hint="default"/>
+      </w:rPr>
+    </w:lvl>
+    <w:lvl w:ilvl="7" w:tplc="44090003" w:tentative="1">
+      <w:start w:val="1"/>
+      <w:numFmt w:val="bullet"/>
+      <w:lvlText w:val="o"/>
+      <w:lvlJc w:val="left"/>
+      <w:pPr>
+        <w:ind w:left="5400" w:hanging="360"/>
+      </w:pPr>
+      <w:rPr>
+        <w:rFonts w:ascii="Courier New" w:hAnsi="Courier New" w:cs="Courier New" w:hint="default"/>
+      </w:rPr>
+    </w:lvl>
+    <w:lvl w:ilvl="8" w:tplc="44090005" w:tentative="1">
+      <w:start w:val="1"/>
+      <w:numFmt w:val="bullet"/>
+      <w:lvlText w:val=""/>
+      <w:lvlJc w:val="left"/>
+      <w:pPr>
+        <w:ind w:left="6120" w:hanging="360"/>
+      </w:pPr>
+      <w:rPr>
+        <w:rFonts w:ascii="Wingdings" w:hAnsi="Wingdings" w:hint="default"/>
+      </w:rPr>
+    </w:lvl>
+  </w:abstractNum>
+  <w:abstractNum w:abstractNumId="10" w15:restartNumberingAfterBreak="0">
     <w:nsid w:val="58383383"/>
     <w:multiLevelType w:val="hybridMultilevel"/>
     <w:tmpl w:val="EF80A6DE"/>
@@ -6632,7 +7260,7 @@
       </w:rPr>
     </w:lvl>
   </w:abstractNum>
-  <w:abstractNum w:abstractNumId="10" w15:restartNumberingAfterBreak="0">
+  <w:abstractNum w:abstractNumId="11" w15:restartNumberingAfterBreak="0">
     <w:nsid w:val="5BA631F5"/>
     <w:multiLevelType w:val="hybridMultilevel"/>
     <w:tmpl w:val="1038A16E"/>
@@ -6746,7 +7374,7 @@
       </w:rPr>
     </w:lvl>
   </w:abstractNum>
-  <w:abstractNum w:abstractNumId="11" w15:restartNumberingAfterBreak="0">
+  <w:abstractNum w:abstractNumId="12" w15:restartNumberingAfterBreak="0">
     <w:nsid w:val="61D27A0E"/>
     <w:multiLevelType w:val="hybridMultilevel"/>
     <w:tmpl w:val="75C8F96E"/>
@@ -6756,7 +7384,7 @@
       <w:lvlText w:val="-"/>
       <w:lvlJc w:val="left"/>
       <w:pPr>
-        <w:ind w:left="644" w:hanging="360"/>
+        <w:ind w:left="360" w:hanging="360"/>
       </w:pPr>
       <w:rPr>
         <w:rFonts w:ascii="Times New Roman" w:eastAsia="Times New Roman" w:hAnsi="Times New Roman" w:cs="Times New Roman" w:hint="default"/>
@@ -6768,7 +7396,7 @@
       <w:lvlText w:val="o"/>
       <w:lvlJc w:val="left"/>
       <w:pPr>
-        <w:ind w:left="1080" w:hanging="360"/>
+        <w:ind w:left="796" w:hanging="360"/>
       </w:pPr>
       <w:rPr>
         <w:rFonts w:ascii="Courier New" w:hAnsi="Courier New" w:cs="Courier New" w:hint="default"/>
@@ -6780,7 +7408,7 @@
       <w:lvlText w:val=""/>
       <w:lvlJc w:val="left"/>
       <w:pPr>
-        <w:ind w:left="1800" w:hanging="360"/>
+        <w:ind w:left="1516" w:hanging="360"/>
       </w:pPr>
       <w:rPr>
         <w:rFonts w:ascii="Wingdings" w:hAnsi="Wingdings" w:hint="default"/>
@@ -6792,7 +7420,7 @@
       <w:lvlText w:val=""/>
       <w:lvlJc w:val="left"/>
       <w:pPr>
-        <w:ind w:left="2520" w:hanging="360"/>
+        <w:ind w:left="2236" w:hanging="360"/>
       </w:pPr>
       <w:rPr>
         <w:rFonts w:ascii="Symbol" w:hAnsi="Symbol" w:hint="default"/>
@@ -6804,7 +7432,7 @@
       <w:lvlText w:val="o"/>
       <w:lvlJc w:val="left"/>
       <w:pPr>
-        <w:ind w:left="3240" w:hanging="360"/>
+        <w:ind w:left="2956" w:hanging="360"/>
       </w:pPr>
       <w:rPr>
         <w:rFonts w:ascii="Courier New" w:hAnsi="Courier New" w:cs="Courier New" w:hint="default"/>
@@ -6816,7 +7444,7 @@
       <w:lvlText w:val=""/>
       <w:lvlJc w:val="left"/>
       <w:pPr>
-        <w:ind w:left="3960" w:hanging="360"/>
+        <w:ind w:left="3676" w:hanging="360"/>
       </w:pPr>
       <w:rPr>
         <w:rFonts w:ascii="Wingdings" w:hAnsi="Wingdings" w:hint="default"/>
@@ -6828,7 +7456,7 @@
       <w:lvlText w:val=""/>
       <w:lvlJc w:val="left"/>
       <w:pPr>
-        <w:ind w:left="4680" w:hanging="360"/>
+        <w:ind w:left="4396" w:hanging="360"/>
       </w:pPr>
       <w:rPr>
         <w:rFonts w:ascii="Symbol" w:hAnsi="Symbol" w:hint="default"/>
@@ -6840,7 +7468,7 @@
       <w:lvlText w:val="o"/>
       <w:lvlJc w:val="left"/>
       <w:pPr>
-        <w:ind w:left="5400" w:hanging="360"/>
+        <w:ind w:left="5116" w:hanging="360"/>
       </w:pPr>
       <w:rPr>
         <w:rFonts w:ascii="Courier New" w:hAnsi="Courier New" w:cs="Courier New" w:hint="default"/>
@@ -6852,6 +7480,119 @@
       <w:lvlText w:val=""/>
       <w:lvlJc w:val="left"/>
       <w:pPr>
+        <w:ind w:left="5836" w:hanging="360"/>
+      </w:pPr>
+      <w:rPr>
+        <w:rFonts w:ascii="Wingdings" w:hAnsi="Wingdings" w:hint="default"/>
+      </w:rPr>
+    </w:lvl>
+  </w:abstractNum>
+  <w:abstractNum w:abstractNumId="13" w15:restartNumberingAfterBreak="0">
+    <w:nsid w:val="71440740"/>
+    <w:multiLevelType w:val="hybridMultilevel"/>
+    <w:tmpl w:val="A574060C"/>
+    <w:lvl w:ilvl="0" w:tplc="44090001">
+      <w:start w:val="1"/>
+      <w:numFmt w:val="bullet"/>
+      <w:lvlText w:val=""/>
+      <w:lvlJc w:val="left"/>
+      <w:pPr>
+        <w:ind w:left="360" w:hanging="360"/>
+      </w:pPr>
+      <w:rPr>
+        <w:rFonts w:ascii="Symbol" w:hAnsi="Symbol" w:hint="default"/>
+      </w:rPr>
+    </w:lvl>
+    <w:lvl w:ilvl="1" w:tplc="44090003" w:tentative="1">
+      <w:start w:val="1"/>
+      <w:numFmt w:val="bullet"/>
+      <w:lvlText w:val="o"/>
+      <w:lvlJc w:val="left"/>
+      <w:pPr>
+        <w:ind w:left="1080" w:hanging="360"/>
+      </w:pPr>
+      <w:rPr>
+        <w:rFonts w:ascii="Courier New" w:hAnsi="Courier New" w:cs="Courier New" w:hint="default"/>
+      </w:rPr>
+    </w:lvl>
+    <w:lvl w:ilvl="2" w:tplc="44090005" w:tentative="1">
+      <w:start w:val="1"/>
+      <w:numFmt w:val="bullet"/>
+      <w:lvlText w:val=""/>
+      <w:lvlJc w:val="left"/>
+      <w:pPr>
+        <w:ind w:left="1800" w:hanging="360"/>
+      </w:pPr>
+      <w:rPr>
+        <w:rFonts w:ascii="Wingdings" w:hAnsi="Wingdings" w:hint="default"/>
+      </w:rPr>
+    </w:lvl>
+    <w:lvl w:ilvl="3" w:tplc="44090001" w:tentative="1">
+      <w:start w:val="1"/>
+      <w:numFmt w:val="bullet"/>
+      <w:lvlText w:val=""/>
+      <w:lvlJc w:val="left"/>
+      <w:pPr>
+        <w:ind w:left="2520" w:hanging="360"/>
+      </w:pPr>
+      <w:rPr>
+        <w:rFonts w:ascii="Symbol" w:hAnsi="Symbol" w:hint="default"/>
+      </w:rPr>
+    </w:lvl>
+    <w:lvl w:ilvl="4" w:tplc="44090003" w:tentative="1">
+      <w:start w:val="1"/>
+      <w:numFmt w:val="bullet"/>
+      <w:lvlText w:val="o"/>
+      <w:lvlJc w:val="left"/>
+      <w:pPr>
+        <w:ind w:left="3240" w:hanging="360"/>
+      </w:pPr>
+      <w:rPr>
+        <w:rFonts w:ascii="Courier New" w:hAnsi="Courier New" w:cs="Courier New" w:hint="default"/>
+      </w:rPr>
+    </w:lvl>
+    <w:lvl w:ilvl="5" w:tplc="44090005" w:tentative="1">
+      <w:start w:val="1"/>
+      <w:numFmt w:val="bullet"/>
+      <w:lvlText w:val=""/>
+      <w:lvlJc w:val="left"/>
+      <w:pPr>
+        <w:ind w:left="3960" w:hanging="360"/>
+      </w:pPr>
+      <w:rPr>
+        <w:rFonts w:ascii="Wingdings" w:hAnsi="Wingdings" w:hint="default"/>
+      </w:rPr>
+    </w:lvl>
+    <w:lvl w:ilvl="6" w:tplc="44090001" w:tentative="1">
+      <w:start w:val="1"/>
+      <w:numFmt w:val="bullet"/>
+      <w:lvlText w:val=""/>
+      <w:lvlJc w:val="left"/>
+      <w:pPr>
+        <w:ind w:left="4680" w:hanging="360"/>
+      </w:pPr>
+      <w:rPr>
+        <w:rFonts w:ascii="Symbol" w:hAnsi="Symbol" w:hint="default"/>
+      </w:rPr>
+    </w:lvl>
+    <w:lvl w:ilvl="7" w:tplc="44090003" w:tentative="1">
+      <w:start w:val="1"/>
+      <w:numFmt w:val="bullet"/>
+      <w:lvlText w:val="o"/>
+      <w:lvlJc w:val="left"/>
+      <w:pPr>
+        <w:ind w:left="5400" w:hanging="360"/>
+      </w:pPr>
+      <w:rPr>
+        <w:rFonts w:ascii="Courier New" w:hAnsi="Courier New" w:cs="Courier New" w:hint="default"/>
+      </w:rPr>
+    </w:lvl>
+    <w:lvl w:ilvl="8" w:tplc="44090005" w:tentative="1">
+      <w:start w:val="1"/>
+      <w:numFmt w:val="bullet"/>
+      <w:lvlText w:val=""/>
+      <w:lvlJc w:val="left"/>
+      <w:pPr>
         <w:ind w:left="6120" w:hanging="360"/>
       </w:pPr>
       <w:rPr>
@@ -6859,7 +7600,7 @@
       </w:rPr>
     </w:lvl>
   </w:abstractNum>
-  <w:abstractNum w:abstractNumId="12" w15:restartNumberingAfterBreak="0">
+  <w:abstractNum w:abstractNumId="14" w15:restartNumberingAfterBreak="0">
     <w:nsid w:val="732060B8"/>
     <w:multiLevelType w:val="hybridMultilevel"/>
     <w:tmpl w:val="5CE8A518"/>
@@ -6972,7 +7713,7 @@
       </w:rPr>
     </w:lvl>
   </w:abstractNum>
-  <w:abstractNum w:abstractNumId="13" w15:restartNumberingAfterBreak="0">
+  <w:abstractNum w:abstractNumId="15" w15:restartNumberingAfterBreak="0">
     <w:nsid w:val="76AC6E80"/>
     <w:multiLevelType w:val="multilevel"/>
     <w:tmpl w:val="C240CA98"/>
@@ -7085,7 +7826,7 @@
       </w:rPr>
     </w:lvl>
   </w:abstractNum>
-  <w:abstractNum w:abstractNumId="14" w15:restartNumberingAfterBreak="0">
+  <w:abstractNum w:abstractNumId="16" w15:restartNumberingAfterBreak="0">
     <w:nsid w:val="77875472"/>
     <w:multiLevelType w:val="hybridMultilevel"/>
     <w:tmpl w:val="7FC2CD6E"/>
@@ -7174,6 +7915,119 @@
       <w:pPr>
         <w:ind w:left="6120" w:hanging="180"/>
       </w:pPr>
+    </w:lvl>
+  </w:abstractNum>
+  <w:abstractNum w:abstractNumId="17" w15:restartNumberingAfterBreak="0">
+    <w:nsid w:val="7A7E1454"/>
+    <w:multiLevelType w:val="hybridMultilevel"/>
+    <w:tmpl w:val="0246A3D6"/>
+    <w:lvl w:ilvl="0" w:tplc="44090001">
+      <w:start w:val="1"/>
+      <w:numFmt w:val="bullet"/>
+      <w:lvlText w:val=""/>
+      <w:lvlJc w:val="left"/>
+      <w:pPr>
+        <w:ind w:left="360" w:hanging="360"/>
+      </w:pPr>
+      <w:rPr>
+        <w:rFonts w:ascii="Symbol" w:hAnsi="Symbol" w:hint="default"/>
+      </w:rPr>
+    </w:lvl>
+    <w:lvl w:ilvl="1" w:tplc="44090003" w:tentative="1">
+      <w:start w:val="1"/>
+      <w:numFmt w:val="bullet"/>
+      <w:lvlText w:val="o"/>
+      <w:lvlJc w:val="left"/>
+      <w:pPr>
+        <w:ind w:left="1080" w:hanging="360"/>
+      </w:pPr>
+      <w:rPr>
+        <w:rFonts w:ascii="Courier New" w:hAnsi="Courier New" w:cs="Courier New" w:hint="default"/>
+      </w:rPr>
+    </w:lvl>
+    <w:lvl w:ilvl="2" w:tplc="44090005" w:tentative="1">
+      <w:start w:val="1"/>
+      <w:numFmt w:val="bullet"/>
+      <w:lvlText w:val=""/>
+      <w:lvlJc w:val="left"/>
+      <w:pPr>
+        <w:ind w:left="1800" w:hanging="360"/>
+      </w:pPr>
+      <w:rPr>
+        <w:rFonts w:ascii="Wingdings" w:hAnsi="Wingdings" w:hint="default"/>
+      </w:rPr>
+    </w:lvl>
+    <w:lvl w:ilvl="3" w:tplc="44090001" w:tentative="1">
+      <w:start w:val="1"/>
+      <w:numFmt w:val="bullet"/>
+      <w:lvlText w:val=""/>
+      <w:lvlJc w:val="left"/>
+      <w:pPr>
+        <w:ind w:left="2520" w:hanging="360"/>
+      </w:pPr>
+      <w:rPr>
+        <w:rFonts w:ascii="Symbol" w:hAnsi="Symbol" w:hint="default"/>
+      </w:rPr>
+    </w:lvl>
+    <w:lvl w:ilvl="4" w:tplc="44090003" w:tentative="1">
+      <w:start w:val="1"/>
+      <w:numFmt w:val="bullet"/>
+      <w:lvlText w:val="o"/>
+      <w:lvlJc w:val="left"/>
+      <w:pPr>
+        <w:ind w:left="3240" w:hanging="360"/>
+      </w:pPr>
+      <w:rPr>
+        <w:rFonts w:ascii="Courier New" w:hAnsi="Courier New" w:cs="Courier New" w:hint="default"/>
+      </w:rPr>
+    </w:lvl>
+    <w:lvl w:ilvl="5" w:tplc="44090005" w:tentative="1">
+      <w:start w:val="1"/>
+      <w:numFmt w:val="bullet"/>
+      <w:lvlText w:val=""/>
+      <w:lvlJc w:val="left"/>
+      <w:pPr>
+        <w:ind w:left="3960" w:hanging="360"/>
+      </w:pPr>
+      <w:rPr>
+        <w:rFonts w:ascii="Wingdings" w:hAnsi="Wingdings" w:hint="default"/>
+      </w:rPr>
+    </w:lvl>
+    <w:lvl w:ilvl="6" w:tplc="44090001" w:tentative="1">
+      <w:start w:val="1"/>
+      <w:numFmt w:val="bullet"/>
+      <w:lvlText w:val=""/>
+      <w:lvlJc w:val="left"/>
+      <w:pPr>
+        <w:ind w:left="4680" w:hanging="360"/>
+      </w:pPr>
+      <w:rPr>
+        <w:rFonts w:ascii="Symbol" w:hAnsi="Symbol" w:hint="default"/>
+      </w:rPr>
+    </w:lvl>
+    <w:lvl w:ilvl="7" w:tplc="44090003" w:tentative="1">
+      <w:start w:val="1"/>
+      <w:numFmt w:val="bullet"/>
+      <w:lvlText w:val="o"/>
+      <w:lvlJc w:val="left"/>
+      <w:pPr>
+        <w:ind w:left="5400" w:hanging="360"/>
+      </w:pPr>
+      <w:rPr>
+        <w:rFonts w:ascii="Courier New" w:hAnsi="Courier New" w:cs="Courier New" w:hint="default"/>
+      </w:rPr>
+    </w:lvl>
+    <w:lvl w:ilvl="8" w:tplc="44090005" w:tentative="1">
+      <w:start w:val="1"/>
+      <w:numFmt w:val="bullet"/>
+      <w:lvlText w:val=""/>
+      <w:lvlJc w:val="left"/>
+      <w:pPr>
+        <w:ind w:left="6120" w:hanging="360"/>
+      </w:pPr>
+      <w:rPr>
+        <w:rFonts w:ascii="Wingdings" w:hAnsi="Wingdings" w:hint="default"/>
+      </w:rPr>
     </w:lvl>
   </w:abstractNum>
   <w:num w:numId="1" w16cid:durableId="286392482">
@@ -7192,22 +8046,22 @@
     <w:abstractNumId w:val="4"/>
   </w:num>
   <w:num w:numId="6" w16cid:durableId="227886086">
-    <w:abstractNumId w:val="14"/>
+    <w:abstractNumId w:val="16"/>
   </w:num>
   <w:num w:numId="7" w16cid:durableId="2072341731">
-    <w:abstractNumId w:val="9"/>
+    <w:abstractNumId w:val="10"/>
   </w:num>
   <w:num w:numId="8" w16cid:durableId="1752656536">
-    <w:abstractNumId w:val="13"/>
+    <w:abstractNumId w:val="15"/>
   </w:num>
   <w:num w:numId="9" w16cid:durableId="130758821">
-    <w:abstractNumId w:val="11"/>
+    <w:abstractNumId w:val="12"/>
   </w:num>
   <w:num w:numId="10" w16cid:durableId="1113137875">
     <w:abstractNumId w:val="5"/>
   </w:num>
   <w:num w:numId="11" w16cid:durableId="374963516">
-    <w:abstractNumId w:val="10"/>
+    <w:abstractNumId w:val="11"/>
   </w:num>
   <w:num w:numId="12" w16cid:durableId="1136803540">
     <w:abstractNumId w:val="0"/>
@@ -7219,7 +8073,16 @@
     <w:abstractNumId w:val="2"/>
   </w:num>
   <w:num w:numId="15" w16cid:durableId="1583946979">
-    <w:abstractNumId w:val="12"/>
+    <w:abstractNumId w:val="14"/>
+  </w:num>
+  <w:num w:numId="16" w16cid:durableId="1082532541">
+    <w:abstractNumId w:val="9"/>
+  </w:num>
+  <w:num w:numId="17" w16cid:durableId="1681814785">
+    <w:abstractNumId w:val="13"/>
+  </w:num>
+  <w:num w:numId="18" w16cid:durableId="1331178141">
+    <w:abstractNumId w:val="17"/>
   </w:num>
 </w:numbering>
 </file>

</xml_diff>